<commit_message>
corrected minor typos in GitHub action lab1
</commit_message>
<xml_diff>
--- a/ADXD2SD3M5-Mike/GIT/Github Action/C#_app_with_GitHub_Actions.docx
+++ b/ADXD2SD3M5-Mike/GIT/Github Action/C#_app_with_GitHub_Actions.docx
@@ -431,6 +431,7 @@
         </w:rPr>
         <w:t xml:space="preserve"> called </w:t>
       </w:r>
+      <w:proofErr w:type="spellStart"/>
       <w:r>
         <w:rPr>
           <w:rFonts w:ascii="Courier New" w:hAnsi="Courier New" w:cs="Courier New"/>
@@ -449,6 +450,7 @@
         </w:rPr>
         <w:t>.App</w:t>
       </w:r>
+      <w:proofErr w:type="spellEnd"/>
     </w:p>
     <w:p>
       <w:pPr>
@@ -481,6 +483,7 @@
           <w:bCs/>
         </w:rPr>
       </w:pPr>
+      <w:proofErr w:type="spellStart"/>
       <w:r>
         <w:rPr>
           <w:rFonts w:ascii="Courier New" w:hAnsi="Courier New" w:cs="Courier New"/>
@@ -488,16 +491,28 @@
           <w:bCs/>
           <w:color w:val="0070C0"/>
         </w:rPr>
-        <w:t xml:space="preserve">mkdir </w:t>
-      </w:r>
+        <w:t>mkdir</w:t>
+      </w:r>
+      <w:proofErr w:type="spellEnd"/>
       <w:r>
         <w:rPr>
           <w:rFonts w:ascii="Courier New" w:hAnsi="Courier New" w:cs="Courier New"/>
           <w:b/>
           <w:bCs/>
+          <w:color w:val="0070C0"/>
+        </w:rPr>
+        <w:t xml:space="preserve"> </w:t>
+      </w:r>
+      <w:proofErr w:type="spellStart"/>
+      <w:r>
+        <w:rPr>
+          <w:rFonts w:ascii="Courier New" w:hAnsi="Courier New" w:cs="Courier New"/>
+          <w:b/>
+          <w:bCs/>
         </w:rPr>
         <w:t>SubscriptionMetrics</w:t>
       </w:r>
+      <w:proofErr w:type="spellEnd"/>
     </w:p>
     <w:p>
       <w:pPr>
@@ -519,6 +534,7 @@
         </w:rPr>
         <w:t xml:space="preserve">cd </w:t>
       </w:r>
+      <w:proofErr w:type="spellStart"/>
       <w:r>
         <w:rPr>
           <w:rFonts w:ascii="Courier New" w:hAnsi="Courier New" w:cs="Courier New"/>
@@ -527,6 +543,7 @@
         </w:rPr>
         <w:t>SubscriptionMetrics</w:t>
       </w:r>
+      <w:proofErr w:type="spellEnd"/>
     </w:p>
     <w:p>
       <w:pPr>
@@ -556,8 +573,36 @@
           <w:b/>
           <w:bCs/>
         </w:rPr>
-        <w:t>new sln -n SubscriptionMetrics</w:t>
-      </w:r>
+        <w:t xml:space="preserve">new </w:t>
+      </w:r>
+      <w:proofErr w:type="spellStart"/>
+      <w:r>
+        <w:rPr>
+          <w:rFonts w:ascii="Courier New" w:hAnsi="Courier New" w:cs="Courier New"/>
+          <w:b/>
+          <w:bCs/>
+        </w:rPr>
+        <w:t>sln</w:t>
+      </w:r>
+      <w:proofErr w:type="spellEnd"/>
+      <w:r>
+        <w:rPr>
+          <w:rFonts w:ascii="Courier New" w:hAnsi="Courier New" w:cs="Courier New"/>
+          <w:b/>
+          <w:bCs/>
+        </w:rPr>
+        <w:t xml:space="preserve"> -n </w:t>
+      </w:r>
+      <w:proofErr w:type="spellStart"/>
+      <w:r>
+        <w:rPr>
+          <w:rFonts w:ascii="Courier New" w:hAnsi="Courier New" w:cs="Courier New"/>
+          <w:b/>
+          <w:bCs/>
+        </w:rPr>
+        <w:t>SubscriptionMetrics</w:t>
+      </w:r>
+      <w:proofErr w:type="spellEnd"/>
       <w:r>
         <w:rPr>
           <w:rFonts w:ascii="Courier New" w:hAnsi="Courier New" w:cs="Courier New"/>
@@ -624,8 +669,18 @@
           <w:b/>
           <w:bCs/>
         </w:rPr>
-        <w:t>new console -n SubscriptionMetrics.App</w:t>
-      </w:r>
+        <w:t xml:space="preserve">new console -n </w:t>
+      </w:r>
+      <w:proofErr w:type="spellStart"/>
+      <w:r>
+        <w:rPr>
+          <w:rFonts w:ascii="Courier New" w:hAnsi="Courier New" w:cs="Courier New"/>
+          <w:b/>
+          <w:bCs/>
+        </w:rPr>
+        <w:t>SubscriptionMetrics.App</w:t>
+      </w:r>
+      <w:proofErr w:type="spellEnd"/>
     </w:p>
     <w:p>
       <w:pPr>
@@ -640,14 +695,25 @@
         </w:rPr>
         <w:t xml:space="preserve">dotnet </w:t>
       </w:r>
+      <w:proofErr w:type="spellStart"/>
       <w:r>
         <w:rPr>
           <w:rFonts w:ascii="Courier New" w:hAnsi="Courier New" w:cs="Courier New"/>
           <w:b/>
           <w:bCs/>
         </w:rPr>
-        <w:t xml:space="preserve">sln add </w:t>
-      </w:r>
+        <w:t>sln</w:t>
+      </w:r>
+      <w:proofErr w:type="spellEnd"/>
+      <w:r>
+        <w:rPr>
+          <w:rFonts w:ascii="Courier New" w:hAnsi="Courier New" w:cs="Courier New"/>
+          <w:b/>
+          <w:bCs/>
+        </w:rPr>
+        <w:t xml:space="preserve"> add </w:t>
+      </w:r>
+      <w:proofErr w:type="spellStart"/>
       <w:r>
         <w:rPr>
           <w:rFonts w:ascii="Courier New" w:hAnsi="Courier New" w:cs="Courier New"/>
@@ -656,8 +722,31 @@
           <w:sz w:val="16"/>
           <w:szCs w:val="16"/>
         </w:rPr>
-        <w:t>SubscriptionMetrics.App/SubscriptionMetrics.App.csproj</w:t>
-      </w:r>
+        <w:t>SubscriptionMetrics.App</w:t>
+      </w:r>
+      <w:proofErr w:type="spellEnd"/>
+      <w:r>
+        <w:rPr>
+          <w:rFonts w:ascii="Courier New" w:hAnsi="Courier New" w:cs="Courier New"/>
+          <w:b/>
+          <w:bCs/>
+          <w:sz w:val="16"/>
+          <w:szCs w:val="16"/>
+        </w:rPr>
+        <w:t>/</w:t>
+      </w:r>
+      <w:proofErr w:type="spellStart"/>
+      <w:r>
+        <w:rPr>
+          <w:rFonts w:ascii="Courier New" w:hAnsi="Courier New" w:cs="Courier New"/>
+          <w:b/>
+          <w:bCs/>
+          <w:sz w:val="16"/>
+          <w:szCs w:val="16"/>
+        </w:rPr>
+        <w:t>SubscriptionMetrics.App.csproj</w:t>
+      </w:r>
+      <w:proofErr w:type="spellEnd"/>
       <w:r>
         <w:rPr>
           <w:rFonts w:ascii="Courier New" w:hAnsi="Courier New" w:cs="Courier New"/>
@@ -716,6 +805,7 @@
         </w:rPr>
         <w:t xml:space="preserve">cd </w:t>
       </w:r>
+      <w:proofErr w:type="spellStart"/>
       <w:r>
         <w:rPr>
           <w:rFonts w:ascii="Courier New" w:hAnsi="Courier New" w:cs="Courier New"/>
@@ -724,6 +814,7 @@
         </w:rPr>
         <w:t>SubscriptionMetrics.App</w:t>
       </w:r>
+      <w:proofErr w:type="spellEnd"/>
     </w:p>
     <w:p>
       <w:pPr>
@@ -856,6 +947,7 @@
         </w:rPr>
         <w:t xml:space="preserve"> by creating a new files called </w:t>
       </w:r>
+      <w:proofErr w:type="spellStart"/>
       <w:r>
         <w:rPr>
           <w:b/>
@@ -864,6 +956,7 @@
         </w:rPr>
         <w:t>CustomerSubscription.cs</w:t>
       </w:r>
+      <w:proofErr w:type="spellEnd"/>
       <w:r>
         <w:t xml:space="preserve"> </w:t>
       </w:r>
@@ -876,12 +969,37 @@
       <w:r>
         <w:t xml:space="preserve">  </w:t>
       </w:r>
-      <w:r>
-        <w:rPr>
-          <w:b/>
-          <w:bCs/>
-        </w:rPr>
-        <w:t>SubscriptionMetrics.App/CustomerSubscription.cs:</w:t>
+      <w:proofErr w:type="spellStart"/>
+      <w:r>
+        <w:rPr>
+          <w:b/>
+          <w:bCs/>
+        </w:rPr>
+        <w:t>SubscriptionMetrics.App</w:t>
+      </w:r>
+      <w:proofErr w:type="spellEnd"/>
+      <w:r>
+        <w:rPr>
+          <w:b/>
+          <w:bCs/>
+        </w:rPr>
+        <w:t>/</w:t>
+      </w:r>
+      <w:proofErr w:type="spellStart"/>
+      <w:r>
+        <w:rPr>
+          <w:b/>
+          <w:bCs/>
+        </w:rPr>
+        <w:t>CustomerSubscription.cs</w:t>
+      </w:r>
+      <w:proofErr w:type="spellEnd"/>
+      <w:r>
+        <w:rPr>
+          <w:b/>
+          <w:bCs/>
+        </w:rPr>
+        <w:t>:</w:t>
       </w:r>
     </w:p>
     <w:p>
@@ -908,12 +1026,21 @@
         </w:rPr>
         <w:t xml:space="preserve">namespace </w:t>
       </w:r>
-      <w:r>
-        <w:rPr>
-          <w:b/>
-          <w:bCs/>
-        </w:rPr>
-        <w:t>SubscriptionMetrics.App;</w:t>
+      <w:proofErr w:type="spellStart"/>
+      <w:r>
+        <w:rPr>
+          <w:b/>
+          <w:bCs/>
+        </w:rPr>
+        <w:t>SubscriptionMetrics.App</w:t>
+      </w:r>
+      <w:proofErr w:type="spellEnd"/>
+      <w:r>
+        <w:rPr>
+          <w:b/>
+          <w:bCs/>
+        </w:rPr>
+        <w:t>;</w:t>
       </w:r>
     </w:p>
     <w:p>
@@ -992,6 +1119,7 @@
         </w:rPr>
         <w:t xml:space="preserve"> </w:t>
       </w:r>
+      <w:proofErr w:type="spellStart"/>
       <w:r>
         <w:rPr>
           <w:rFonts w:ascii="Cascadia Mono" w:hAnsi="Cascadia Mono" w:cs="Cascadia Mono"/>
@@ -1005,6 +1133,7 @@
         </w:rPr>
         <w:t>CustomerSubscription</w:t>
       </w:r>
+      <w:proofErr w:type="spellEnd"/>
     </w:p>
     <w:p>
       <w:pPr>
@@ -1117,7 +1246,35 @@
           <w:highlight w:val="white"/>
           <w:lang w:eastAsia="en-US"/>
         </w:rPr>
-        <w:t xml:space="preserve"> CustomerId { </w:t>
+        <w:t xml:space="preserve"> </w:t>
+      </w:r>
+      <w:proofErr w:type="spellStart"/>
+      <w:r>
+        <w:rPr>
+          <w:rFonts w:ascii="Cascadia Mono" w:hAnsi="Cascadia Mono" w:cs="Cascadia Mono"/>
+          <w:b/>
+          <w:bCs/>
+          <w:color w:val="000000"/>
+          <w:sz w:val="19"/>
+          <w:szCs w:val="19"/>
+          <w:highlight w:val="white"/>
+          <w:lang w:eastAsia="en-US"/>
+        </w:rPr>
+        <w:t>CustomerId</w:t>
+      </w:r>
+      <w:proofErr w:type="spellEnd"/>
+      <w:r>
+        <w:rPr>
+          <w:rFonts w:ascii="Cascadia Mono" w:hAnsi="Cascadia Mono" w:cs="Cascadia Mono"/>
+          <w:b/>
+          <w:bCs/>
+          <w:color w:val="000000"/>
+          <w:sz w:val="19"/>
+          <w:szCs w:val="19"/>
+          <w:highlight w:val="white"/>
+          <w:lang w:eastAsia="en-US"/>
+        </w:rPr>
+        <w:t xml:space="preserve"> { </w:t>
       </w:r>
       <w:r>
         <w:rPr>
@@ -1226,7 +1383,35 @@
           <w:highlight w:val="white"/>
           <w:lang w:eastAsia="en-US"/>
         </w:rPr>
-        <w:t xml:space="preserve"> MonthlyAmount { </w:t>
+        <w:t xml:space="preserve"> </w:t>
+      </w:r>
+      <w:proofErr w:type="spellStart"/>
+      <w:r>
+        <w:rPr>
+          <w:rFonts w:ascii="Cascadia Mono" w:hAnsi="Cascadia Mono" w:cs="Cascadia Mono"/>
+          <w:b/>
+          <w:bCs/>
+          <w:color w:val="000000"/>
+          <w:sz w:val="19"/>
+          <w:szCs w:val="19"/>
+          <w:highlight w:val="white"/>
+          <w:lang w:eastAsia="en-US"/>
+        </w:rPr>
+        <w:t>MonthlyAmount</w:t>
+      </w:r>
+      <w:proofErr w:type="spellEnd"/>
+      <w:r>
+        <w:rPr>
+          <w:rFonts w:ascii="Cascadia Mono" w:hAnsi="Cascadia Mono" w:cs="Cascadia Mono"/>
+          <w:b/>
+          <w:bCs/>
+          <w:color w:val="000000"/>
+          <w:sz w:val="19"/>
+          <w:szCs w:val="19"/>
+          <w:highlight w:val="white"/>
+          <w:lang w:eastAsia="en-US"/>
+        </w:rPr>
+        <w:t xml:space="preserve"> { </w:t>
       </w:r>
       <w:r>
         <w:rPr>
@@ -1335,7 +1520,35 @@
           <w:highlight w:val="white"/>
           <w:lang w:eastAsia="en-US"/>
         </w:rPr>
-        <w:t xml:space="preserve"> IsActive { </w:t>
+        <w:t xml:space="preserve"> </w:t>
+      </w:r>
+      <w:proofErr w:type="spellStart"/>
+      <w:r>
+        <w:rPr>
+          <w:rFonts w:ascii="Cascadia Mono" w:hAnsi="Cascadia Mono" w:cs="Cascadia Mono"/>
+          <w:b/>
+          <w:bCs/>
+          <w:color w:val="000000"/>
+          <w:sz w:val="19"/>
+          <w:szCs w:val="19"/>
+          <w:highlight w:val="white"/>
+          <w:lang w:eastAsia="en-US"/>
+        </w:rPr>
+        <w:t>IsActive</w:t>
+      </w:r>
+      <w:proofErr w:type="spellEnd"/>
+      <w:r>
+        <w:rPr>
+          <w:rFonts w:ascii="Cascadia Mono" w:hAnsi="Cascadia Mono" w:cs="Cascadia Mono"/>
+          <w:b/>
+          <w:bCs/>
+          <w:color w:val="000000"/>
+          <w:sz w:val="19"/>
+          <w:szCs w:val="19"/>
+          <w:highlight w:val="white"/>
+          <w:lang w:eastAsia="en-US"/>
+        </w:rPr>
+        <w:t xml:space="preserve"> { </w:t>
       </w:r>
       <w:r>
         <w:rPr>
@@ -1438,6 +1651,7 @@
         </w:rPr>
         <w:t xml:space="preserve"> </w:t>
       </w:r>
+      <w:proofErr w:type="spellStart"/>
       <w:r>
         <w:rPr>
           <w:rFonts w:ascii="Cascadia Mono" w:hAnsi="Cascadia Mono" w:cs="Cascadia Mono"/>
@@ -1451,6 +1665,7 @@
         </w:rPr>
         <w:t>CustomerSubscription</w:t>
       </w:r>
+      <w:proofErr w:type="spellEnd"/>
       <w:r>
         <w:rPr>
           <w:rFonts w:ascii="Cascadia Mono" w:hAnsi="Cascadia Mono" w:cs="Cascadia Mono"/>
@@ -1488,7 +1703,35 @@
           <w:highlight w:val="white"/>
           <w:lang w:eastAsia="en-US"/>
         </w:rPr>
-        <w:t xml:space="preserve"> customerId, </w:t>
+        <w:t xml:space="preserve"> </w:t>
+      </w:r>
+      <w:proofErr w:type="spellStart"/>
+      <w:r>
+        <w:rPr>
+          <w:rFonts w:ascii="Cascadia Mono" w:hAnsi="Cascadia Mono" w:cs="Cascadia Mono"/>
+          <w:b/>
+          <w:bCs/>
+          <w:color w:val="000000"/>
+          <w:sz w:val="19"/>
+          <w:szCs w:val="19"/>
+          <w:highlight w:val="white"/>
+          <w:lang w:eastAsia="en-US"/>
+        </w:rPr>
+        <w:t>customerId</w:t>
+      </w:r>
+      <w:proofErr w:type="spellEnd"/>
+      <w:r>
+        <w:rPr>
+          <w:rFonts w:ascii="Cascadia Mono" w:hAnsi="Cascadia Mono" w:cs="Cascadia Mono"/>
+          <w:b/>
+          <w:bCs/>
+          <w:color w:val="000000"/>
+          <w:sz w:val="19"/>
+          <w:szCs w:val="19"/>
+          <w:highlight w:val="white"/>
+          <w:lang w:eastAsia="en-US"/>
+        </w:rPr>
+        <w:t xml:space="preserve">, </w:t>
       </w:r>
       <w:r>
         <w:rPr>
@@ -1514,7 +1757,35 @@
           <w:highlight w:val="white"/>
           <w:lang w:eastAsia="en-US"/>
         </w:rPr>
-        <w:t xml:space="preserve"> monthlyAmount, </w:t>
+        <w:t xml:space="preserve"> </w:t>
+      </w:r>
+      <w:proofErr w:type="spellStart"/>
+      <w:r>
+        <w:rPr>
+          <w:rFonts w:ascii="Cascadia Mono" w:hAnsi="Cascadia Mono" w:cs="Cascadia Mono"/>
+          <w:b/>
+          <w:bCs/>
+          <w:color w:val="000000"/>
+          <w:sz w:val="19"/>
+          <w:szCs w:val="19"/>
+          <w:highlight w:val="white"/>
+          <w:lang w:eastAsia="en-US"/>
+        </w:rPr>
+        <w:t>monthlyAmount</w:t>
+      </w:r>
+      <w:proofErr w:type="spellEnd"/>
+      <w:r>
+        <w:rPr>
+          <w:rFonts w:ascii="Cascadia Mono" w:hAnsi="Cascadia Mono" w:cs="Cascadia Mono"/>
+          <w:b/>
+          <w:bCs/>
+          <w:color w:val="000000"/>
+          <w:sz w:val="19"/>
+          <w:szCs w:val="19"/>
+          <w:highlight w:val="white"/>
+          <w:lang w:eastAsia="en-US"/>
+        </w:rPr>
+        <w:t xml:space="preserve">, </w:t>
       </w:r>
       <w:r>
         <w:rPr>
@@ -1657,7 +1928,35 @@
           <w:highlight w:val="white"/>
           <w:lang w:eastAsia="en-US"/>
         </w:rPr>
-        <w:t xml:space="preserve"> isActive)</w:t>
+        <w:t xml:space="preserve"> </w:t>
+      </w:r>
+      <w:proofErr w:type="spellStart"/>
+      <w:r>
+        <w:rPr>
+          <w:rFonts w:ascii="Cascadia Mono" w:hAnsi="Cascadia Mono" w:cs="Cascadia Mono"/>
+          <w:b/>
+          <w:bCs/>
+          <w:color w:val="000000"/>
+          <w:sz w:val="19"/>
+          <w:szCs w:val="19"/>
+          <w:highlight w:val="white"/>
+          <w:lang w:eastAsia="en-US"/>
+        </w:rPr>
+        <w:t>isActive</w:t>
+      </w:r>
+      <w:proofErr w:type="spellEnd"/>
+      <w:r>
+        <w:rPr>
+          <w:rFonts w:ascii="Cascadia Mono" w:hAnsi="Cascadia Mono" w:cs="Cascadia Mono"/>
+          <w:b/>
+          <w:bCs/>
+          <w:color w:val="000000"/>
+          <w:sz w:val="19"/>
+          <w:szCs w:val="19"/>
+          <w:highlight w:val="white"/>
+          <w:lang w:eastAsia="en-US"/>
+        </w:rPr>
+        <w:t>)</w:t>
       </w:r>
     </w:p>
     <w:p>
@@ -1747,6 +2046,7 @@
         </w:rPr>
         <w:t xml:space="preserve"> (</w:t>
       </w:r>
+      <w:proofErr w:type="spellStart"/>
       <w:r>
         <w:rPr>
           <w:rFonts w:ascii="Cascadia Mono" w:hAnsi="Cascadia Mono" w:cs="Cascadia Mono"/>
@@ -1771,7 +2071,49 @@
           <w:highlight w:val="white"/>
           <w:lang w:eastAsia="en-US"/>
         </w:rPr>
-        <w:t>.IsNullOrWhiteSpace(customerId))</w:t>
+        <w:t>.IsNullOrWhiteSpace</w:t>
+      </w:r>
+      <w:proofErr w:type="spellEnd"/>
+      <w:r>
+        <w:rPr>
+          <w:rFonts w:ascii="Cascadia Mono" w:hAnsi="Cascadia Mono" w:cs="Cascadia Mono"/>
+          <w:b/>
+          <w:bCs/>
+          <w:color w:val="000000"/>
+          <w:sz w:val="19"/>
+          <w:szCs w:val="19"/>
+          <w:highlight w:val="white"/>
+          <w:lang w:eastAsia="en-US"/>
+        </w:rPr>
+        <w:t>(</w:t>
+      </w:r>
+      <w:proofErr w:type="spellStart"/>
+      <w:r>
+        <w:rPr>
+          <w:rFonts w:ascii="Cascadia Mono" w:hAnsi="Cascadia Mono" w:cs="Cascadia Mono"/>
+          <w:b/>
+          <w:bCs/>
+          <w:color w:val="000000"/>
+          <w:sz w:val="19"/>
+          <w:szCs w:val="19"/>
+          <w:highlight w:val="white"/>
+          <w:lang w:eastAsia="en-US"/>
+        </w:rPr>
+        <w:t>customerId</w:t>
+      </w:r>
+      <w:proofErr w:type="spellEnd"/>
+      <w:r>
+        <w:rPr>
+          <w:rFonts w:ascii="Cascadia Mono" w:hAnsi="Cascadia Mono" w:cs="Cascadia Mono"/>
+          <w:b/>
+          <w:bCs/>
+          <w:color w:val="000000"/>
+          <w:sz w:val="19"/>
+          <w:szCs w:val="19"/>
+          <w:highlight w:val="white"/>
+          <w:lang w:eastAsia="en-US"/>
+        </w:rPr>
+        <w:t>))</w:t>
       </w:r>
     </w:p>
     <w:p>
@@ -1856,6 +2198,7 @@
         </w:rPr>
         <w:t xml:space="preserve"> </w:t>
       </w:r>
+      <w:proofErr w:type="spellStart"/>
       <w:r>
         <w:rPr>
           <w:rFonts w:ascii="Cascadia Mono" w:hAnsi="Cascadia Mono" w:cs="Cascadia Mono"/>
@@ -1869,6 +2212,7 @@
         </w:rPr>
         <w:t>ArgumentException</w:t>
       </w:r>
+      <w:proofErr w:type="spellEnd"/>
       <w:r>
         <w:rPr>
           <w:rFonts w:ascii="Cascadia Mono" w:hAnsi="Cascadia Mono" w:cs="Cascadia Mono"/>
@@ -1893,7 +2237,35 @@
           <w:highlight w:val="white"/>
           <w:lang w:eastAsia="en-US"/>
         </w:rPr>
-        <w:t>"CustomerId is required"</w:t>
+        <w:t>"</w:t>
+      </w:r>
+      <w:proofErr w:type="spellStart"/>
+      <w:r>
+        <w:rPr>
+          <w:rFonts w:ascii="Cascadia Mono" w:hAnsi="Cascadia Mono" w:cs="Cascadia Mono"/>
+          <w:b/>
+          <w:bCs/>
+          <w:color w:val="A31515"/>
+          <w:sz w:val="19"/>
+          <w:szCs w:val="19"/>
+          <w:highlight w:val="white"/>
+          <w:lang w:eastAsia="en-US"/>
+        </w:rPr>
+        <w:t>CustomerId</w:t>
+      </w:r>
+      <w:proofErr w:type="spellEnd"/>
+      <w:r>
+        <w:rPr>
+          <w:rFonts w:ascii="Cascadia Mono" w:hAnsi="Cascadia Mono" w:cs="Cascadia Mono"/>
+          <w:b/>
+          <w:bCs/>
+          <w:color w:val="A31515"/>
+          <w:sz w:val="19"/>
+          <w:szCs w:val="19"/>
+          <w:highlight w:val="white"/>
+          <w:lang w:eastAsia="en-US"/>
+        </w:rPr>
+        <w:t xml:space="preserve"> is required"</w:t>
       </w:r>
       <w:r>
         <w:rPr>
@@ -2038,6 +2410,7 @@
         </w:rPr>
         <w:tab/>
       </w:r>
+      <w:proofErr w:type="spellStart"/>
       <w:r>
         <w:rPr>
           <w:rFonts w:ascii="Cascadia Mono" w:hAnsi="Cascadia Mono" w:cs="Cascadia Mono"/>
@@ -2051,18 +2424,47 @@
         </w:rPr>
         <w:t>nameof</w:t>
       </w:r>
-      <w:r>
-        <w:rPr>
-          <w:rFonts w:ascii="Cascadia Mono" w:hAnsi="Cascadia Mono" w:cs="Cascadia Mono"/>
-          <w:b/>
-          <w:bCs/>
-          <w:color w:val="000000"/>
-          <w:sz w:val="19"/>
-          <w:szCs w:val="19"/>
-          <w:highlight w:val="white"/>
-          <w:lang w:eastAsia="en-US"/>
-        </w:rPr>
-        <w:t>(customerId));</w:t>
+      <w:proofErr w:type="spellEnd"/>
+      <w:r>
+        <w:rPr>
+          <w:rFonts w:ascii="Cascadia Mono" w:hAnsi="Cascadia Mono" w:cs="Cascadia Mono"/>
+          <w:b/>
+          <w:bCs/>
+          <w:color w:val="000000"/>
+          <w:sz w:val="19"/>
+          <w:szCs w:val="19"/>
+          <w:highlight w:val="white"/>
+          <w:lang w:eastAsia="en-US"/>
+        </w:rPr>
+        <w:t>(</w:t>
+      </w:r>
+      <w:proofErr w:type="spellStart"/>
+      <w:r>
+        <w:rPr>
+          <w:rFonts w:ascii="Cascadia Mono" w:hAnsi="Cascadia Mono" w:cs="Cascadia Mono"/>
+          <w:b/>
+          <w:bCs/>
+          <w:color w:val="000000"/>
+          <w:sz w:val="19"/>
+          <w:szCs w:val="19"/>
+          <w:highlight w:val="white"/>
+          <w:lang w:eastAsia="en-US"/>
+        </w:rPr>
+        <w:t>customerId</w:t>
+      </w:r>
+      <w:proofErr w:type="spellEnd"/>
+      <w:r>
+        <w:rPr>
+          <w:rFonts w:ascii="Cascadia Mono" w:hAnsi="Cascadia Mono" w:cs="Cascadia Mono"/>
+          <w:b/>
+          <w:bCs/>
+          <w:color w:val="000000"/>
+          <w:sz w:val="19"/>
+          <w:szCs w:val="19"/>
+          <w:highlight w:val="white"/>
+          <w:lang w:eastAsia="en-US"/>
+        </w:rPr>
+        <w:t>));</w:t>
       </w:r>
     </w:p>
     <w:p>
@@ -2137,7 +2539,35 @@
           <w:highlight w:val="white"/>
           <w:lang w:eastAsia="en-US"/>
         </w:rPr>
-        <w:t xml:space="preserve"> (monthlyAmount &lt; 0)</w:t>
+        <w:t xml:space="preserve"> (</w:t>
+      </w:r>
+      <w:proofErr w:type="spellStart"/>
+      <w:r>
+        <w:rPr>
+          <w:rFonts w:ascii="Cascadia Mono" w:hAnsi="Cascadia Mono" w:cs="Cascadia Mono"/>
+          <w:b/>
+          <w:bCs/>
+          <w:color w:val="000000"/>
+          <w:sz w:val="19"/>
+          <w:szCs w:val="19"/>
+          <w:highlight w:val="white"/>
+          <w:lang w:eastAsia="en-US"/>
+        </w:rPr>
+        <w:t>monthlyAmount</w:t>
+      </w:r>
+      <w:proofErr w:type="spellEnd"/>
+      <w:r>
+        <w:rPr>
+          <w:rFonts w:ascii="Cascadia Mono" w:hAnsi="Cascadia Mono" w:cs="Cascadia Mono"/>
+          <w:b/>
+          <w:bCs/>
+          <w:color w:val="000000"/>
+          <w:sz w:val="19"/>
+          <w:szCs w:val="19"/>
+          <w:highlight w:val="white"/>
+          <w:lang w:eastAsia="en-US"/>
+        </w:rPr>
+        <w:t xml:space="preserve"> &lt; 0)</w:t>
       </w:r>
     </w:p>
     <w:p>
@@ -2222,6 +2652,7 @@
         </w:rPr>
         <w:t xml:space="preserve"> </w:t>
       </w:r>
+      <w:proofErr w:type="spellStart"/>
       <w:r>
         <w:rPr>
           <w:rFonts w:ascii="Cascadia Mono" w:hAnsi="Cascadia Mono" w:cs="Cascadia Mono"/>
@@ -2235,6 +2666,7 @@
         </w:rPr>
         <w:t>ArgumentException</w:t>
       </w:r>
+      <w:proofErr w:type="spellEnd"/>
       <w:r>
         <w:rPr>
           <w:rFonts w:ascii="Cascadia Mono" w:hAnsi="Cascadia Mono" w:cs="Cascadia Mono"/>
@@ -2391,6 +2823,7 @@
         </w:rPr>
         <w:tab/>
       </w:r>
+      <w:proofErr w:type="spellStart"/>
       <w:r>
         <w:rPr>
           <w:rFonts w:ascii="Cascadia Mono" w:hAnsi="Cascadia Mono" w:cs="Cascadia Mono"/>
@@ -2404,18 +2837,47 @@
         </w:rPr>
         <w:t>nameof</w:t>
       </w:r>
-      <w:r>
-        <w:rPr>
-          <w:rFonts w:ascii="Cascadia Mono" w:hAnsi="Cascadia Mono" w:cs="Cascadia Mono"/>
-          <w:b/>
-          <w:bCs/>
-          <w:color w:val="000000"/>
-          <w:sz w:val="19"/>
-          <w:szCs w:val="19"/>
-          <w:highlight w:val="white"/>
-          <w:lang w:eastAsia="en-US"/>
-        </w:rPr>
-        <w:t>(monthlyAmount));</w:t>
+      <w:proofErr w:type="spellEnd"/>
+      <w:r>
+        <w:rPr>
+          <w:rFonts w:ascii="Cascadia Mono" w:hAnsi="Cascadia Mono" w:cs="Cascadia Mono"/>
+          <w:b/>
+          <w:bCs/>
+          <w:color w:val="000000"/>
+          <w:sz w:val="19"/>
+          <w:szCs w:val="19"/>
+          <w:highlight w:val="white"/>
+          <w:lang w:eastAsia="en-US"/>
+        </w:rPr>
+        <w:t>(</w:t>
+      </w:r>
+      <w:proofErr w:type="spellStart"/>
+      <w:r>
+        <w:rPr>
+          <w:rFonts w:ascii="Cascadia Mono" w:hAnsi="Cascadia Mono" w:cs="Cascadia Mono"/>
+          <w:b/>
+          <w:bCs/>
+          <w:color w:val="000000"/>
+          <w:sz w:val="19"/>
+          <w:szCs w:val="19"/>
+          <w:highlight w:val="white"/>
+          <w:lang w:eastAsia="en-US"/>
+        </w:rPr>
+        <w:t>monthlyAmount</w:t>
+      </w:r>
+      <w:proofErr w:type="spellEnd"/>
+      <w:r>
+        <w:rPr>
+          <w:rFonts w:ascii="Cascadia Mono" w:hAnsi="Cascadia Mono" w:cs="Cascadia Mono"/>
+          <w:b/>
+          <w:bCs/>
+          <w:color w:val="000000"/>
+          <w:sz w:val="19"/>
+          <w:szCs w:val="19"/>
+          <w:highlight w:val="white"/>
+          <w:lang w:eastAsia="en-US"/>
+        </w:rPr>
+        <w:t>));</w:t>
       </w:r>
     </w:p>
     <w:p>
@@ -2464,7 +2926,63 @@
           <w:highlight w:val="white"/>
           <w:lang w:eastAsia="en-US"/>
         </w:rPr>
-        <w:t xml:space="preserve">        CustomerId = customerId;</w:t>
+        <w:t xml:space="preserve">        </w:t>
+      </w:r>
+      <w:proofErr w:type="spellStart"/>
+      <w:r>
+        <w:rPr>
+          <w:rFonts w:ascii="Cascadia Mono" w:hAnsi="Cascadia Mono" w:cs="Cascadia Mono"/>
+          <w:b/>
+          <w:bCs/>
+          <w:color w:val="000000"/>
+          <w:sz w:val="19"/>
+          <w:szCs w:val="19"/>
+          <w:highlight w:val="white"/>
+          <w:lang w:eastAsia="en-US"/>
+        </w:rPr>
+        <w:t>CustomerId</w:t>
+      </w:r>
+      <w:proofErr w:type="spellEnd"/>
+      <w:r>
+        <w:rPr>
+          <w:rFonts w:ascii="Cascadia Mono" w:hAnsi="Cascadia Mono" w:cs="Cascadia Mono"/>
+          <w:b/>
+          <w:bCs/>
+          <w:color w:val="000000"/>
+          <w:sz w:val="19"/>
+          <w:szCs w:val="19"/>
+          <w:highlight w:val="white"/>
+          <w:lang w:eastAsia="en-US"/>
+        </w:rPr>
+        <w:t xml:space="preserve"> = </w:t>
+      </w:r>
+      <w:proofErr w:type="spellStart"/>
+      <w:r>
+        <w:rPr>
+          <w:rFonts w:ascii="Cascadia Mono" w:hAnsi="Cascadia Mono" w:cs="Cascadia Mono"/>
+          <w:b/>
+          <w:bCs/>
+          <w:color w:val="000000"/>
+          <w:sz w:val="19"/>
+          <w:szCs w:val="19"/>
+          <w:highlight w:val="white"/>
+          <w:lang w:eastAsia="en-US"/>
+        </w:rPr>
+        <w:t>customerId</w:t>
+      </w:r>
+      <w:proofErr w:type="spellEnd"/>
+      <w:r>
+        <w:rPr>
+          <w:rFonts w:ascii="Cascadia Mono" w:hAnsi="Cascadia Mono" w:cs="Cascadia Mono"/>
+          <w:b/>
+          <w:bCs/>
+          <w:color w:val="000000"/>
+          <w:sz w:val="19"/>
+          <w:szCs w:val="19"/>
+          <w:highlight w:val="white"/>
+          <w:lang w:eastAsia="en-US"/>
+        </w:rPr>
+        <w:t>;</w:t>
       </w:r>
     </w:p>
     <w:p>
@@ -2495,7 +3013,63 @@
           <w:highlight w:val="white"/>
           <w:lang w:eastAsia="en-US"/>
         </w:rPr>
-        <w:t xml:space="preserve">        MonthlyAmount = monthlyAmount;</w:t>
+        <w:t xml:space="preserve">        </w:t>
+      </w:r>
+      <w:proofErr w:type="spellStart"/>
+      <w:r>
+        <w:rPr>
+          <w:rFonts w:ascii="Cascadia Mono" w:hAnsi="Cascadia Mono" w:cs="Cascadia Mono"/>
+          <w:b/>
+          <w:bCs/>
+          <w:color w:val="000000"/>
+          <w:sz w:val="19"/>
+          <w:szCs w:val="19"/>
+          <w:highlight w:val="white"/>
+          <w:lang w:eastAsia="en-US"/>
+        </w:rPr>
+        <w:t>MonthlyAmount</w:t>
+      </w:r>
+      <w:proofErr w:type="spellEnd"/>
+      <w:r>
+        <w:rPr>
+          <w:rFonts w:ascii="Cascadia Mono" w:hAnsi="Cascadia Mono" w:cs="Cascadia Mono"/>
+          <w:b/>
+          <w:bCs/>
+          <w:color w:val="000000"/>
+          <w:sz w:val="19"/>
+          <w:szCs w:val="19"/>
+          <w:highlight w:val="white"/>
+          <w:lang w:eastAsia="en-US"/>
+        </w:rPr>
+        <w:t xml:space="preserve"> = </w:t>
+      </w:r>
+      <w:proofErr w:type="spellStart"/>
+      <w:r>
+        <w:rPr>
+          <w:rFonts w:ascii="Cascadia Mono" w:hAnsi="Cascadia Mono" w:cs="Cascadia Mono"/>
+          <w:b/>
+          <w:bCs/>
+          <w:color w:val="000000"/>
+          <w:sz w:val="19"/>
+          <w:szCs w:val="19"/>
+          <w:highlight w:val="white"/>
+          <w:lang w:eastAsia="en-US"/>
+        </w:rPr>
+        <w:t>monthlyAmount</w:t>
+      </w:r>
+      <w:proofErr w:type="spellEnd"/>
+      <w:r>
+        <w:rPr>
+          <w:rFonts w:ascii="Cascadia Mono" w:hAnsi="Cascadia Mono" w:cs="Cascadia Mono"/>
+          <w:b/>
+          <w:bCs/>
+          <w:color w:val="000000"/>
+          <w:sz w:val="19"/>
+          <w:szCs w:val="19"/>
+          <w:highlight w:val="white"/>
+          <w:lang w:eastAsia="en-US"/>
+        </w:rPr>
+        <w:t>;</w:t>
       </w:r>
     </w:p>
     <w:p>
@@ -2526,7 +3100,63 @@
           <w:highlight w:val="white"/>
           <w:lang w:eastAsia="en-US"/>
         </w:rPr>
-        <w:t xml:space="preserve">        IsActive = isActive;</w:t>
+        <w:t xml:space="preserve">        </w:t>
+      </w:r>
+      <w:proofErr w:type="spellStart"/>
+      <w:r>
+        <w:rPr>
+          <w:rFonts w:ascii="Cascadia Mono" w:hAnsi="Cascadia Mono" w:cs="Cascadia Mono"/>
+          <w:b/>
+          <w:bCs/>
+          <w:color w:val="000000"/>
+          <w:sz w:val="19"/>
+          <w:szCs w:val="19"/>
+          <w:highlight w:val="white"/>
+          <w:lang w:eastAsia="en-US"/>
+        </w:rPr>
+        <w:t>IsActive</w:t>
+      </w:r>
+      <w:proofErr w:type="spellEnd"/>
+      <w:r>
+        <w:rPr>
+          <w:rFonts w:ascii="Cascadia Mono" w:hAnsi="Cascadia Mono" w:cs="Cascadia Mono"/>
+          <w:b/>
+          <w:bCs/>
+          <w:color w:val="000000"/>
+          <w:sz w:val="19"/>
+          <w:szCs w:val="19"/>
+          <w:highlight w:val="white"/>
+          <w:lang w:eastAsia="en-US"/>
+        </w:rPr>
+        <w:t xml:space="preserve"> = </w:t>
+      </w:r>
+      <w:proofErr w:type="spellStart"/>
+      <w:r>
+        <w:rPr>
+          <w:rFonts w:ascii="Cascadia Mono" w:hAnsi="Cascadia Mono" w:cs="Cascadia Mono"/>
+          <w:b/>
+          <w:bCs/>
+          <w:color w:val="000000"/>
+          <w:sz w:val="19"/>
+          <w:szCs w:val="19"/>
+          <w:highlight w:val="white"/>
+          <w:lang w:eastAsia="en-US"/>
+        </w:rPr>
+        <w:t>isActive</w:t>
+      </w:r>
+      <w:proofErr w:type="spellEnd"/>
+      <w:r>
+        <w:rPr>
+          <w:rFonts w:ascii="Cascadia Mono" w:hAnsi="Cascadia Mono" w:cs="Cascadia Mono"/>
+          <w:b/>
+          <w:bCs/>
+          <w:color w:val="000000"/>
+          <w:sz w:val="19"/>
+          <w:szCs w:val="19"/>
+          <w:highlight w:val="white"/>
+          <w:lang w:eastAsia="en-US"/>
+        </w:rPr>
+        <w:t>;</w:t>
       </w:r>
     </w:p>
     <w:p>
@@ -2623,14 +3253,34 @@
       <w:r>
         <w:t xml:space="preserve">In </w:t>
       </w:r>
+      <w:proofErr w:type="spellStart"/>
       <w:r>
         <w:rPr>
           <w:b/>
           <w:bCs/>
           <w:color w:val="77206D" w:themeColor="accent5" w:themeShade="BF"/>
         </w:rPr>
-        <w:t>SubscriptionMetrics.App/RevenueCalculator.cs</w:t>
-      </w:r>
+        <w:t>SubscriptionMetrics.App</w:t>
+      </w:r>
+      <w:proofErr w:type="spellEnd"/>
+      <w:r>
+        <w:rPr>
+          <w:b/>
+          <w:bCs/>
+          <w:color w:val="77206D" w:themeColor="accent5" w:themeShade="BF"/>
+        </w:rPr>
+        <w:t>/</w:t>
+      </w:r>
+      <w:proofErr w:type="spellStart"/>
+      <w:r>
+        <w:rPr>
+          <w:b/>
+          <w:bCs/>
+          <w:color w:val="77206D" w:themeColor="accent5" w:themeShade="BF"/>
+        </w:rPr>
+        <w:t>RevenueCalculator.cs</w:t>
+      </w:r>
+      <w:proofErr w:type="spellEnd"/>
       <w:r>
         <w:t>:</w:t>
       </w:r>
@@ -2675,7 +3325,31 @@
           <w:highlight w:val="white"/>
           <w:lang w:eastAsia="en-US"/>
         </w:rPr>
-        <w:t xml:space="preserve"> SubscriptionMetrics.App;</w:t>
+        <w:t xml:space="preserve"> </w:t>
+      </w:r>
+      <w:proofErr w:type="spellStart"/>
+      <w:r>
+        <w:rPr>
+          <w:rFonts w:ascii="Cascadia Mono" w:hAnsi="Cascadia Mono" w:cs="Cascadia Mono"/>
+          <w:color w:val="000000"/>
+          <w:sz w:val="19"/>
+          <w:szCs w:val="19"/>
+          <w:highlight w:val="white"/>
+          <w:lang w:eastAsia="en-US"/>
+        </w:rPr>
+        <w:t>SubscriptionMetrics.App</w:t>
+      </w:r>
+      <w:proofErr w:type="spellEnd"/>
+      <w:r>
+        <w:rPr>
+          <w:rFonts w:ascii="Cascadia Mono" w:hAnsi="Cascadia Mono" w:cs="Cascadia Mono"/>
+          <w:color w:val="000000"/>
+          <w:sz w:val="19"/>
+          <w:szCs w:val="19"/>
+          <w:highlight w:val="white"/>
+          <w:lang w:eastAsia="en-US"/>
+        </w:rPr>
+        <w:t>;</w:t>
       </w:r>
     </w:p>
     <w:p>
@@ -2757,6 +3431,7 @@
         </w:rPr>
         <w:t xml:space="preserve"> </w:t>
       </w:r>
+      <w:proofErr w:type="spellStart"/>
       <w:r>
         <w:rPr>
           <w:rFonts w:ascii="Cascadia Mono" w:hAnsi="Cascadia Mono" w:cs="Cascadia Mono"/>
@@ -2768,6 +3443,7 @@
         </w:rPr>
         <w:t>RevenueSummary</w:t>
       </w:r>
+      <w:proofErr w:type="spellEnd"/>
     </w:p>
     <w:p>
       <w:pPr>
@@ -2868,7 +3544,31 @@
           <w:highlight w:val="white"/>
           <w:lang w:eastAsia="en-US"/>
         </w:rPr>
-        <w:t xml:space="preserve"> ActiveMrr { </w:t>
+        <w:t xml:space="preserve"> </w:t>
+      </w:r>
+      <w:proofErr w:type="spellStart"/>
+      <w:r>
+        <w:rPr>
+          <w:rFonts w:ascii="Cascadia Mono" w:hAnsi="Cascadia Mono" w:cs="Cascadia Mono"/>
+          <w:color w:val="000000"/>
+          <w:sz w:val="19"/>
+          <w:szCs w:val="19"/>
+          <w:highlight w:val="white"/>
+          <w:lang w:eastAsia="en-US"/>
+        </w:rPr>
+        <w:t>ActiveMrr</w:t>
+      </w:r>
+      <w:proofErr w:type="spellEnd"/>
+      <w:r>
+        <w:rPr>
+          <w:rFonts w:ascii="Cascadia Mono" w:hAnsi="Cascadia Mono" w:cs="Cascadia Mono"/>
+          <w:color w:val="000000"/>
+          <w:sz w:val="19"/>
+          <w:szCs w:val="19"/>
+          <w:highlight w:val="white"/>
+          <w:lang w:eastAsia="en-US"/>
+        </w:rPr>
+        <w:t xml:space="preserve"> { </w:t>
       </w:r>
       <w:r>
         <w:rPr>
@@ -2963,7 +3663,31 @@
           <w:highlight w:val="white"/>
           <w:lang w:eastAsia="en-US"/>
         </w:rPr>
-        <w:t xml:space="preserve"> ChurnedRevenue { </w:t>
+        <w:t xml:space="preserve"> </w:t>
+      </w:r>
+      <w:proofErr w:type="spellStart"/>
+      <w:r>
+        <w:rPr>
+          <w:rFonts w:ascii="Cascadia Mono" w:hAnsi="Cascadia Mono" w:cs="Cascadia Mono"/>
+          <w:color w:val="000000"/>
+          <w:sz w:val="19"/>
+          <w:szCs w:val="19"/>
+          <w:highlight w:val="white"/>
+          <w:lang w:eastAsia="en-US"/>
+        </w:rPr>
+        <w:t>ChurnedRevenue</w:t>
+      </w:r>
+      <w:proofErr w:type="spellEnd"/>
+      <w:r>
+        <w:rPr>
+          <w:rFonts w:ascii="Cascadia Mono" w:hAnsi="Cascadia Mono" w:cs="Cascadia Mono"/>
+          <w:color w:val="000000"/>
+          <w:sz w:val="19"/>
+          <w:szCs w:val="19"/>
+          <w:highlight w:val="white"/>
+          <w:lang w:eastAsia="en-US"/>
+        </w:rPr>
+        <w:t xml:space="preserve"> { </w:t>
       </w:r>
       <w:r>
         <w:rPr>
@@ -3058,7 +3782,79 @@
           <w:highlight w:val="white"/>
           <w:lang w:eastAsia="en-US"/>
         </w:rPr>
-        <w:t xml:space="preserve"> NetMrr =&gt; ActiveMrr - ChurnedRevenue;</w:t>
+        <w:t xml:space="preserve"> </w:t>
+      </w:r>
+      <w:proofErr w:type="spellStart"/>
+      <w:r>
+        <w:rPr>
+          <w:rFonts w:ascii="Cascadia Mono" w:hAnsi="Cascadia Mono" w:cs="Cascadia Mono"/>
+          <w:color w:val="000000"/>
+          <w:sz w:val="19"/>
+          <w:szCs w:val="19"/>
+          <w:highlight w:val="white"/>
+          <w:lang w:eastAsia="en-US"/>
+        </w:rPr>
+        <w:t>NetMrr</w:t>
+      </w:r>
+      <w:proofErr w:type="spellEnd"/>
+      <w:r>
+        <w:rPr>
+          <w:rFonts w:ascii="Cascadia Mono" w:hAnsi="Cascadia Mono" w:cs="Cascadia Mono"/>
+          <w:color w:val="000000"/>
+          <w:sz w:val="19"/>
+          <w:szCs w:val="19"/>
+          <w:highlight w:val="white"/>
+          <w:lang w:eastAsia="en-US"/>
+        </w:rPr>
+        <w:t xml:space="preserve"> =&gt; </w:t>
+      </w:r>
+      <w:proofErr w:type="spellStart"/>
+      <w:r>
+        <w:rPr>
+          <w:rFonts w:ascii="Cascadia Mono" w:hAnsi="Cascadia Mono" w:cs="Cascadia Mono"/>
+          <w:color w:val="000000"/>
+          <w:sz w:val="19"/>
+          <w:szCs w:val="19"/>
+          <w:highlight w:val="white"/>
+          <w:lang w:eastAsia="en-US"/>
+        </w:rPr>
+        <w:t>ActiveMrr</w:t>
+      </w:r>
+      <w:proofErr w:type="spellEnd"/>
+      <w:r>
+        <w:rPr>
+          <w:rFonts w:ascii="Cascadia Mono" w:hAnsi="Cascadia Mono" w:cs="Cascadia Mono"/>
+          <w:color w:val="000000"/>
+          <w:sz w:val="19"/>
+          <w:szCs w:val="19"/>
+          <w:highlight w:val="white"/>
+          <w:lang w:eastAsia="en-US"/>
+        </w:rPr>
+        <w:t xml:space="preserve"> - </w:t>
+      </w:r>
+      <w:proofErr w:type="spellStart"/>
+      <w:r>
+        <w:rPr>
+          <w:rFonts w:ascii="Cascadia Mono" w:hAnsi="Cascadia Mono" w:cs="Cascadia Mono"/>
+          <w:color w:val="000000"/>
+          <w:sz w:val="19"/>
+          <w:szCs w:val="19"/>
+          <w:highlight w:val="white"/>
+          <w:lang w:eastAsia="en-US"/>
+        </w:rPr>
+        <w:t>ChurnedRevenue</w:t>
+      </w:r>
+      <w:proofErr w:type="spellEnd"/>
+      <w:r>
+        <w:rPr>
+          <w:rFonts w:ascii="Cascadia Mono" w:hAnsi="Cascadia Mono" w:cs="Cascadia Mono"/>
+          <w:color w:val="000000"/>
+          <w:sz w:val="19"/>
+          <w:szCs w:val="19"/>
+          <w:highlight w:val="white"/>
+          <w:lang w:eastAsia="en-US"/>
+        </w:rPr>
+        <w:t>;</w:t>
       </w:r>
     </w:p>
     <w:p>
@@ -3129,6 +3925,7 @@
         </w:rPr>
         <w:t xml:space="preserve"> </w:t>
       </w:r>
+      <w:proofErr w:type="spellStart"/>
       <w:r>
         <w:rPr>
           <w:rFonts w:ascii="Cascadia Mono" w:hAnsi="Cascadia Mono" w:cs="Cascadia Mono"/>
@@ -3140,6 +3937,7 @@
         </w:rPr>
         <w:t>RevenueSummary</w:t>
       </w:r>
+      <w:proofErr w:type="spellEnd"/>
       <w:r>
         <w:rPr>
           <w:rFonts w:ascii="Cascadia Mono" w:hAnsi="Cascadia Mono" w:cs="Cascadia Mono"/>
@@ -3171,7 +3969,31 @@
           <w:highlight w:val="white"/>
           <w:lang w:eastAsia="en-US"/>
         </w:rPr>
-        <w:t xml:space="preserve"> activeMrr, </w:t>
+        <w:t xml:space="preserve"> </w:t>
+      </w:r>
+      <w:proofErr w:type="spellStart"/>
+      <w:r>
+        <w:rPr>
+          <w:rFonts w:ascii="Cascadia Mono" w:hAnsi="Cascadia Mono" w:cs="Cascadia Mono"/>
+          <w:color w:val="000000"/>
+          <w:sz w:val="19"/>
+          <w:szCs w:val="19"/>
+          <w:highlight w:val="white"/>
+          <w:lang w:eastAsia="en-US"/>
+        </w:rPr>
+        <w:t>activeMrr</w:t>
+      </w:r>
+      <w:proofErr w:type="spellEnd"/>
+      <w:r>
+        <w:rPr>
+          <w:rFonts w:ascii="Cascadia Mono" w:hAnsi="Cascadia Mono" w:cs="Cascadia Mono"/>
+          <w:color w:val="000000"/>
+          <w:sz w:val="19"/>
+          <w:szCs w:val="19"/>
+          <w:highlight w:val="white"/>
+          <w:lang w:eastAsia="en-US"/>
+        </w:rPr>
+        <w:t xml:space="preserve">, </w:t>
       </w:r>
       <w:r>
         <w:rPr>
@@ -3193,7 +4015,31 @@
           <w:highlight w:val="white"/>
           <w:lang w:eastAsia="en-US"/>
         </w:rPr>
-        <w:t xml:space="preserve"> churnedRevenue)</w:t>
+        <w:t xml:space="preserve"> </w:t>
+      </w:r>
+      <w:proofErr w:type="spellStart"/>
+      <w:r>
+        <w:rPr>
+          <w:rFonts w:ascii="Cascadia Mono" w:hAnsi="Cascadia Mono" w:cs="Cascadia Mono"/>
+          <w:color w:val="000000"/>
+          <w:sz w:val="19"/>
+          <w:szCs w:val="19"/>
+          <w:highlight w:val="white"/>
+          <w:lang w:eastAsia="en-US"/>
+        </w:rPr>
+        <w:t>churnedRevenue</w:t>
+      </w:r>
+      <w:proofErr w:type="spellEnd"/>
+      <w:r>
+        <w:rPr>
+          <w:rFonts w:ascii="Cascadia Mono" w:hAnsi="Cascadia Mono" w:cs="Cascadia Mono"/>
+          <w:color w:val="000000"/>
+          <w:sz w:val="19"/>
+          <w:szCs w:val="19"/>
+          <w:highlight w:val="white"/>
+          <w:lang w:eastAsia="en-US"/>
+        </w:rPr>
+        <w:t>)</w:t>
       </w:r>
     </w:p>
     <w:p>
@@ -3251,7 +4097,55 @@
           <w:highlight w:val="white"/>
           <w:lang w:eastAsia="en-US"/>
         </w:rPr>
-        <w:t xml:space="preserve">        ActiveMrr = activeMrr;</w:t>
+        <w:t xml:space="preserve">        </w:t>
+      </w:r>
+      <w:proofErr w:type="spellStart"/>
+      <w:r>
+        <w:rPr>
+          <w:rFonts w:ascii="Cascadia Mono" w:hAnsi="Cascadia Mono" w:cs="Cascadia Mono"/>
+          <w:color w:val="000000"/>
+          <w:sz w:val="19"/>
+          <w:szCs w:val="19"/>
+          <w:highlight w:val="white"/>
+          <w:lang w:eastAsia="en-US"/>
+        </w:rPr>
+        <w:t>ActiveMrr</w:t>
+      </w:r>
+      <w:proofErr w:type="spellEnd"/>
+      <w:r>
+        <w:rPr>
+          <w:rFonts w:ascii="Cascadia Mono" w:hAnsi="Cascadia Mono" w:cs="Cascadia Mono"/>
+          <w:color w:val="000000"/>
+          <w:sz w:val="19"/>
+          <w:szCs w:val="19"/>
+          <w:highlight w:val="white"/>
+          <w:lang w:eastAsia="en-US"/>
+        </w:rPr>
+        <w:t xml:space="preserve"> = </w:t>
+      </w:r>
+      <w:proofErr w:type="spellStart"/>
+      <w:r>
+        <w:rPr>
+          <w:rFonts w:ascii="Cascadia Mono" w:hAnsi="Cascadia Mono" w:cs="Cascadia Mono"/>
+          <w:color w:val="000000"/>
+          <w:sz w:val="19"/>
+          <w:szCs w:val="19"/>
+          <w:highlight w:val="white"/>
+          <w:lang w:eastAsia="en-US"/>
+        </w:rPr>
+        <w:t>activeMrr</w:t>
+      </w:r>
+      <w:proofErr w:type="spellEnd"/>
+      <w:r>
+        <w:rPr>
+          <w:rFonts w:ascii="Cascadia Mono" w:hAnsi="Cascadia Mono" w:cs="Cascadia Mono"/>
+          <w:color w:val="000000"/>
+          <w:sz w:val="19"/>
+          <w:szCs w:val="19"/>
+          <w:highlight w:val="white"/>
+          <w:lang w:eastAsia="en-US"/>
+        </w:rPr>
+        <w:t>;</w:t>
       </w:r>
     </w:p>
     <w:p>
@@ -3280,7 +4174,55 @@
           <w:highlight w:val="white"/>
           <w:lang w:eastAsia="en-US"/>
         </w:rPr>
-        <w:t xml:space="preserve">        ChurnedRevenue = churnedRevenue;</w:t>
+        <w:t xml:space="preserve">        </w:t>
+      </w:r>
+      <w:proofErr w:type="spellStart"/>
+      <w:r>
+        <w:rPr>
+          <w:rFonts w:ascii="Cascadia Mono" w:hAnsi="Cascadia Mono" w:cs="Cascadia Mono"/>
+          <w:color w:val="000000"/>
+          <w:sz w:val="19"/>
+          <w:szCs w:val="19"/>
+          <w:highlight w:val="white"/>
+          <w:lang w:eastAsia="en-US"/>
+        </w:rPr>
+        <w:t>ChurnedRevenue</w:t>
+      </w:r>
+      <w:proofErr w:type="spellEnd"/>
+      <w:r>
+        <w:rPr>
+          <w:rFonts w:ascii="Cascadia Mono" w:hAnsi="Cascadia Mono" w:cs="Cascadia Mono"/>
+          <w:color w:val="000000"/>
+          <w:sz w:val="19"/>
+          <w:szCs w:val="19"/>
+          <w:highlight w:val="white"/>
+          <w:lang w:eastAsia="en-US"/>
+        </w:rPr>
+        <w:t xml:space="preserve"> = </w:t>
+      </w:r>
+      <w:proofErr w:type="spellStart"/>
+      <w:r>
+        <w:rPr>
+          <w:rFonts w:ascii="Cascadia Mono" w:hAnsi="Cascadia Mono" w:cs="Cascadia Mono"/>
+          <w:color w:val="000000"/>
+          <w:sz w:val="19"/>
+          <w:szCs w:val="19"/>
+          <w:highlight w:val="white"/>
+          <w:lang w:eastAsia="en-US"/>
+        </w:rPr>
+        <w:t>churnedRevenue</w:t>
+      </w:r>
+      <w:proofErr w:type="spellEnd"/>
+      <w:r>
+        <w:rPr>
+          <w:rFonts w:ascii="Cascadia Mono" w:hAnsi="Cascadia Mono" w:cs="Cascadia Mono"/>
+          <w:color w:val="000000"/>
+          <w:sz w:val="19"/>
+          <w:szCs w:val="19"/>
+          <w:highlight w:val="white"/>
+          <w:lang w:eastAsia="en-US"/>
+        </w:rPr>
+        <w:t>;</w:t>
       </w:r>
     </w:p>
     <w:p>
@@ -3442,6 +4384,7 @@
         </w:rPr>
         <w:t xml:space="preserve"> </w:t>
       </w:r>
+      <w:proofErr w:type="spellStart"/>
       <w:r>
         <w:rPr>
           <w:rFonts w:ascii="Cascadia Mono" w:hAnsi="Cascadia Mono" w:cs="Cascadia Mono"/>
@@ -3453,6 +4396,7 @@
         </w:rPr>
         <w:t>RevenueCalculator</w:t>
       </w:r>
+      <w:proofErr w:type="spellEnd"/>
     </w:p>
     <w:p>
       <w:pPr>
@@ -3555,6 +4499,7 @@
         </w:rPr>
         <w:t xml:space="preserve"> </w:t>
       </w:r>
+      <w:proofErr w:type="spellStart"/>
       <w:r>
         <w:rPr>
           <w:rFonts w:ascii="Cascadia Mono" w:hAnsi="Cascadia Mono" w:cs="Cascadia Mono"/>
@@ -3566,6 +4511,7 @@
         </w:rPr>
         <w:t>RevenueSummary</w:t>
       </w:r>
+      <w:proofErr w:type="spellEnd"/>
       <w:r>
         <w:rPr>
           <w:rFonts w:ascii="Cascadia Mono" w:hAnsi="Cascadia Mono" w:cs="Cascadia Mono"/>
@@ -3621,6 +4567,7 @@
         </w:rPr>
         <w:tab/>
       </w:r>
+      <w:proofErr w:type="spellStart"/>
       <w:r>
         <w:rPr>
           <w:rFonts w:ascii="Cascadia Mono" w:hAnsi="Cascadia Mono" w:cs="Cascadia Mono"/>
@@ -3632,16 +4579,65 @@
         </w:rPr>
         <w:t>IEnumerable</w:t>
       </w:r>
-      <w:r>
-        <w:rPr>
-          <w:rFonts w:ascii="Cascadia Mono" w:hAnsi="Cascadia Mono" w:cs="Cascadia Mono"/>
-          <w:color w:val="000000"/>
-          <w:sz w:val="19"/>
-          <w:szCs w:val="19"/>
-          <w:highlight w:val="white"/>
-          <w:lang w:eastAsia="en-US"/>
-        </w:rPr>
-        <w:t>&lt;CustomerSubscription&gt; subscriptionsBefore,</w:t>
+      <w:proofErr w:type="spellEnd"/>
+      <w:r>
+        <w:rPr>
+          <w:rFonts w:ascii="Cascadia Mono" w:hAnsi="Cascadia Mono" w:cs="Cascadia Mono"/>
+          <w:color w:val="000000"/>
+          <w:sz w:val="19"/>
+          <w:szCs w:val="19"/>
+          <w:highlight w:val="white"/>
+          <w:lang w:eastAsia="en-US"/>
+        </w:rPr>
+        <w:t>&lt;</w:t>
+      </w:r>
+      <w:proofErr w:type="spellStart"/>
+      <w:r>
+        <w:rPr>
+          <w:rFonts w:ascii="Cascadia Mono" w:hAnsi="Cascadia Mono" w:cs="Cascadia Mono"/>
+          <w:color w:val="000000"/>
+          <w:sz w:val="19"/>
+          <w:szCs w:val="19"/>
+          <w:highlight w:val="white"/>
+          <w:lang w:eastAsia="en-US"/>
+        </w:rPr>
+        <w:t>CustomerSubscription</w:t>
+      </w:r>
+      <w:proofErr w:type="spellEnd"/>
+      <w:r>
+        <w:rPr>
+          <w:rFonts w:ascii="Cascadia Mono" w:hAnsi="Cascadia Mono" w:cs="Cascadia Mono"/>
+          <w:color w:val="000000"/>
+          <w:sz w:val="19"/>
+          <w:szCs w:val="19"/>
+          <w:highlight w:val="white"/>
+          <w:lang w:eastAsia="en-US"/>
+        </w:rPr>
+        <w:t xml:space="preserve">&gt; </w:t>
+      </w:r>
+      <w:proofErr w:type="spellStart"/>
+      <w:r>
+        <w:rPr>
+          <w:rFonts w:ascii="Cascadia Mono" w:hAnsi="Cascadia Mono" w:cs="Cascadia Mono"/>
+          <w:color w:val="000000"/>
+          <w:sz w:val="19"/>
+          <w:szCs w:val="19"/>
+          <w:highlight w:val="white"/>
+          <w:lang w:eastAsia="en-US"/>
+        </w:rPr>
+        <w:t>subscriptionsBefore</w:t>
+      </w:r>
+      <w:proofErr w:type="spellEnd"/>
+      <w:r>
+        <w:rPr>
+          <w:rFonts w:ascii="Cascadia Mono" w:hAnsi="Cascadia Mono" w:cs="Cascadia Mono"/>
+          <w:color w:val="000000"/>
+          <w:sz w:val="19"/>
+          <w:szCs w:val="19"/>
+          <w:highlight w:val="white"/>
+          <w:lang w:eastAsia="en-US"/>
+        </w:rPr>
+        <w:t>,</w:t>
       </w:r>
     </w:p>
     <w:p>
@@ -3662,6 +4658,7 @@
           <w:lang w:eastAsia="en-US"/>
         </w:rPr>
       </w:pPr>
+      <w:proofErr w:type="spellStart"/>
       <w:r>
         <w:rPr>
           <w:rFonts w:ascii="Cascadia Mono" w:hAnsi="Cascadia Mono" w:cs="Cascadia Mono"/>
@@ -3673,16 +4670,65 @@
         </w:rPr>
         <w:t>IEnumerable</w:t>
       </w:r>
-      <w:r>
-        <w:rPr>
-          <w:rFonts w:ascii="Cascadia Mono" w:hAnsi="Cascadia Mono" w:cs="Cascadia Mono"/>
-          <w:color w:val="000000"/>
-          <w:sz w:val="19"/>
-          <w:szCs w:val="19"/>
-          <w:highlight w:val="white"/>
-          <w:lang w:eastAsia="en-US"/>
-        </w:rPr>
-        <w:t>&lt;CustomerSubscription&gt; subscriptionsAfter)</w:t>
+      <w:proofErr w:type="spellEnd"/>
+      <w:r>
+        <w:rPr>
+          <w:rFonts w:ascii="Cascadia Mono" w:hAnsi="Cascadia Mono" w:cs="Cascadia Mono"/>
+          <w:color w:val="000000"/>
+          <w:sz w:val="19"/>
+          <w:szCs w:val="19"/>
+          <w:highlight w:val="white"/>
+          <w:lang w:eastAsia="en-US"/>
+        </w:rPr>
+        <w:t>&lt;</w:t>
+      </w:r>
+      <w:proofErr w:type="spellStart"/>
+      <w:r>
+        <w:rPr>
+          <w:rFonts w:ascii="Cascadia Mono" w:hAnsi="Cascadia Mono" w:cs="Cascadia Mono"/>
+          <w:color w:val="000000"/>
+          <w:sz w:val="19"/>
+          <w:szCs w:val="19"/>
+          <w:highlight w:val="white"/>
+          <w:lang w:eastAsia="en-US"/>
+        </w:rPr>
+        <w:t>CustomerSubscription</w:t>
+      </w:r>
+      <w:proofErr w:type="spellEnd"/>
+      <w:r>
+        <w:rPr>
+          <w:rFonts w:ascii="Cascadia Mono" w:hAnsi="Cascadia Mono" w:cs="Cascadia Mono"/>
+          <w:color w:val="000000"/>
+          <w:sz w:val="19"/>
+          <w:szCs w:val="19"/>
+          <w:highlight w:val="white"/>
+          <w:lang w:eastAsia="en-US"/>
+        </w:rPr>
+        <w:t xml:space="preserve">&gt; </w:t>
+      </w:r>
+      <w:proofErr w:type="spellStart"/>
+      <w:r>
+        <w:rPr>
+          <w:rFonts w:ascii="Cascadia Mono" w:hAnsi="Cascadia Mono" w:cs="Cascadia Mono"/>
+          <w:color w:val="000000"/>
+          <w:sz w:val="19"/>
+          <w:szCs w:val="19"/>
+          <w:highlight w:val="white"/>
+          <w:lang w:eastAsia="en-US"/>
+        </w:rPr>
+        <w:t>subscriptionsAfter</w:t>
+      </w:r>
+      <w:proofErr w:type="spellEnd"/>
+      <w:r>
+        <w:rPr>
+          <w:rFonts w:ascii="Cascadia Mono" w:hAnsi="Cascadia Mono" w:cs="Cascadia Mono"/>
+          <w:color w:val="000000"/>
+          <w:sz w:val="19"/>
+          <w:szCs w:val="19"/>
+          <w:highlight w:val="white"/>
+          <w:lang w:eastAsia="en-US"/>
+        </w:rPr>
+        <w:t>)</w:t>
       </w:r>
     </w:p>
     <w:p>
@@ -3762,7 +4808,79 @@
           <w:highlight w:val="white"/>
           <w:lang w:eastAsia="en-US"/>
         </w:rPr>
-        <w:t xml:space="preserve"> beforeActive = subscriptionsBefore.Where(s =&gt; s.IsActive).Sum(s =&gt; </w:t>
+        <w:t xml:space="preserve"> </w:t>
+      </w:r>
+      <w:proofErr w:type="spellStart"/>
+      <w:r>
+        <w:rPr>
+          <w:rFonts w:ascii="Cascadia Mono" w:hAnsi="Cascadia Mono" w:cs="Cascadia Mono"/>
+          <w:color w:val="000000"/>
+          <w:sz w:val="19"/>
+          <w:szCs w:val="19"/>
+          <w:highlight w:val="white"/>
+          <w:lang w:eastAsia="en-US"/>
+        </w:rPr>
+        <w:t>beforeActive</w:t>
+      </w:r>
+      <w:proofErr w:type="spellEnd"/>
+      <w:r>
+        <w:rPr>
+          <w:rFonts w:ascii="Cascadia Mono" w:hAnsi="Cascadia Mono" w:cs="Cascadia Mono"/>
+          <w:color w:val="000000"/>
+          <w:sz w:val="19"/>
+          <w:szCs w:val="19"/>
+          <w:highlight w:val="white"/>
+          <w:lang w:eastAsia="en-US"/>
+        </w:rPr>
+        <w:t xml:space="preserve"> = </w:t>
+      </w:r>
+      <w:proofErr w:type="spellStart"/>
+      <w:r>
+        <w:rPr>
+          <w:rFonts w:ascii="Cascadia Mono" w:hAnsi="Cascadia Mono" w:cs="Cascadia Mono"/>
+          <w:color w:val="000000"/>
+          <w:sz w:val="19"/>
+          <w:szCs w:val="19"/>
+          <w:highlight w:val="white"/>
+          <w:lang w:eastAsia="en-US"/>
+        </w:rPr>
+        <w:t>subscriptionsBefore.Where</w:t>
+      </w:r>
+      <w:proofErr w:type="spellEnd"/>
+      <w:r>
+        <w:rPr>
+          <w:rFonts w:ascii="Cascadia Mono" w:hAnsi="Cascadia Mono" w:cs="Cascadia Mono"/>
+          <w:color w:val="000000"/>
+          <w:sz w:val="19"/>
+          <w:szCs w:val="19"/>
+          <w:highlight w:val="white"/>
+          <w:lang w:eastAsia="en-US"/>
+        </w:rPr>
+        <w:t xml:space="preserve">(s =&gt; </w:t>
+      </w:r>
+      <w:proofErr w:type="spellStart"/>
+      <w:r>
+        <w:rPr>
+          <w:rFonts w:ascii="Cascadia Mono" w:hAnsi="Cascadia Mono" w:cs="Cascadia Mono"/>
+          <w:color w:val="000000"/>
+          <w:sz w:val="19"/>
+          <w:szCs w:val="19"/>
+          <w:highlight w:val="white"/>
+          <w:lang w:eastAsia="en-US"/>
+        </w:rPr>
+        <w:t>s.IsActive</w:t>
+      </w:r>
+      <w:proofErr w:type="spellEnd"/>
+      <w:r>
+        <w:rPr>
+          <w:rFonts w:ascii="Cascadia Mono" w:hAnsi="Cascadia Mono" w:cs="Cascadia Mono"/>
+          <w:color w:val="000000"/>
+          <w:sz w:val="19"/>
+          <w:szCs w:val="19"/>
+          <w:highlight w:val="white"/>
+          <w:lang w:eastAsia="en-US"/>
+        </w:rPr>
+        <w:t xml:space="preserve">).Sum(s =&gt; </w:t>
       </w:r>
       <w:r>
         <w:rPr>
@@ -3862,7 +4980,30 @@
           <w:lang w:eastAsia="en-US"/>
         </w:rPr>
         <w:tab/>
-        <w:t>s.MonthlyAmount);</w:t>
+      </w:r>
+      <w:proofErr w:type="spellStart"/>
+      <w:r>
+        <w:rPr>
+          <w:rFonts w:ascii="Cascadia Mono" w:hAnsi="Cascadia Mono" w:cs="Cascadia Mono"/>
+          <w:color w:val="000000"/>
+          <w:sz w:val="19"/>
+          <w:szCs w:val="19"/>
+          <w:highlight w:val="white"/>
+          <w:lang w:eastAsia="en-US"/>
+        </w:rPr>
+        <w:t>s.MonthlyAmount</w:t>
+      </w:r>
+      <w:proofErr w:type="spellEnd"/>
+      <w:r>
+        <w:rPr>
+          <w:rFonts w:ascii="Cascadia Mono" w:hAnsi="Cascadia Mono" w:cs="Cascadia Mono"/>
+          <w:color w:val="000000"/>
+          <w:sz w:val="19"/>
+          <w:szCs w:val="19"/>
+          <w:highlight w:val="white"/>
+          <w:lang w:eastAsia="en-US"/>
+        </w:rPr>
+        <w:t>);</w:t>
       </w:r>
     </w:p>
     <w:p>
@@ -3913,7 +5054,79 @@
           <w:highlight w:val="white"/>
           <w:lang w:eastAsia="en-US"/>
         </w:rPr>
-        <w:t xml:space="preserve"> afterActive = subscriptionsAfter.Where(s =&gt; s.IsActive).Sum(s =&gt; </w:t>
+        <w:t xml:space="preserve"> </w:t>
+      </w:r>
+      <w:proofErr w:type="spellStart"/>
+      <w:r>
+        <w:rPr>
+          <w:rFonts w:ascii="Cascadia Mono" w:hAnsi="Cascadia Mono" w:cs="Cascadia Mono"/>
+          <w:color w:val="000000"/>
+          <w:sz w:val="19"/>
+          <w:szCs w:val="19"/>
+          <w:highlight w:val="white"/>
+          <w:lang w:eastAsia="en-US"/>
+        </w:rPr>
+        <w:t>afterActive</w:t>
+      </w:r>
+      <w:proofErr w:type="spellEnd"/>
+      <w:r>
+        <w:rPr>
+          <w:rFonts w:ascii="Cascadia Mono" w:hAnsi="Cascadia Mono" w:cs="Cascadia Mono"/>
+          <w:color w:val="000000"/>
+          <w:sz w:val="19"/>
+          <w:szCs w:val="19"/>
+          <w:highlight w:val="white"/>
+          <w:lang w:eastAsia="en-US"/>
+        </w:rPr>
+        <w:t xml:space="preserve"> = </w:t>
+      </w:r>
+      <w:proofErr w:type="spellStart"/>
+      <w:r>
+        <w:rPr>
+          <w:rFonts w:ascii="Cascadia Mono" w:hAnsi="Cascadia Mono" w:cs="Cascadia Mono"/>
+          <w:color w:val="000000"/>
+          <w:sz w:val="19"/>
+          <w:szCs w:val="19"/>
+          <w:highlight w:val="white"/>
+          <w:lang w:eastAsia="en-US"/>
+        </w:rPr>
+        <w:t>subscriptionsAfter.Where</w:t>
+      </w:r>
+      <w:proofErr w:type="spellEnd"/>
+      <w:r>
+        <w:rPr>
+          <w:rFonts w:ascii="Cascadia Mono" w:hAnsi="Cascadia Mono" w:cs="Cascadia Mono"/>
+          <w:color w:val="000000"/>
+          <w:sz w:val="19"/>
+          <w:szCs w:val="19"/>
+          <w:highlight w:val="white"/>
+          <w:lang w:eastAsia="en-US"/>
+        </w:rPr>
+        <w:t xml:space="preserve">(s =&gt; </w:t>
+      </w:r>
+      <w:proofErr w:type="spellStart"/>
+      <w:r>
+        <w:rPr>
+          <w:rFonts w:ascii="Cascadia Mono" w:hAnsi="Cascadia Mono" w:cs="Cascadia Mono"/>
+          <w:color w:val="000000"/>
+          <w:sz w:val="19"/>
+          <w:szCs w:val="19"/>
+          <w:highlight w:val="white"/>
+          <w:lang w:eastAsia="en-US"/>
+        </w:rPr>
+        <w:t>s.IsActive</w:t>
+      </w:r>
+      <w:proofErr w:type="spellEnd"/>
+      <w:r>
+        <w:rPr>
+          <w:rFonts w:ascii="Cascadia Mono" w:hAnsi="Cascadia Mono" w:cs="Cascadia Mono"/>
+          <w:color w:val="000000"/>
+          <w:sz w:val="19"/>
+          <w:szCs w:val="19"/>
+          <w:highlight w:val="white"/>
+          <w:lang w:eastAsia="en-US"/>
+        </w:rPr>
+        <w:t xml:space="preserve">).Sum(s =&gt; </w:t>
       </w:r>
       <w:r>
         <w:rPr>
@@ -4024,7 +5237,30 @@
           <w:lang w:eastAsia="en-US"/>
         </w:rPr>
         <w:tab/>
-        <w:t>s.MonthlyAmount);</w:t>
+      </w:r>
+      <w:proofErr w:type="spellStart"/>
+      <w:r>
+        <w:rPr>
+          <w:rFonts w:ascii="Cascadia Mono" w:hAnsi="Cascadia Mono" w:cs="Cascadia Mono"/>
+          <w:color w:val="000000"/>
+          <w:sz w:val="19"/>
+          <w:szCs w:val="19"/>
+          <w:highlight w:val="white"/>
+          <w:lang w:eastAsia="en-US"/>
+        </w:rPr>
+        <w:t>s.MonthlyAmount</w:t>
+      </w:r>
+      <w:proofErr w:type="spellEnd"/>
+      <w:r>
+        <w:rPr>
+          <w:rFonts w:ascii="Cascadia Mono" w:hAnsi="Cascadia Mono" w:cs="Cascadia Mono"/>
+          <w:color w:val="000000"/>
+          <w:sz w:val="19"/>
+          <w:szCs w:val="19"/>
+          <w:highlight w:val="white"/>
+          <w:lang w:eastAsia="en-US"/>
+        </w:rPr>
+        <w:t>);</w:t>
       </w:r>
     </w:p>
     <w:p>
@@ -4093,7 +5329,79 @@
           <w:highlight w:val="white"/>
           <w:lang w:eastAsia="en-US"/>
         </w:rPr>
-        <w:t xml:space="preserve"> churnedRevenue = beforeActive - afterActive;</w:t>
+        <w:t xml:space="preserve"> </w:t>
+      </w:r>
+      <w:proofErr w:type="spellStart"/>
+      <w:r>
+        <w:rPr>
+          <w:rFonts w:ascii="Cascadia Mono" w:hAnsi="Cascadia Mono" w:cs="Cascadia Mono"/>
+          <w:color w:val="000000"/>
+          <w:sz w:val="19"/>
+          <w:szCs w:val="19"/>
+          <w:highlight w:val="white"/>
+          <w:lang w:eastAsia="en-US"/>
+        </w:rPr>
+        <w:t>churnedRevenue</w:t>
+      </w:r>
+      <w:proofErr w:type="spellEnd"/>
+      <w:r>
+        <w:rPr>
+          <w:rFonts w:ascii="Cascadia Mono" w:hAnsi="Cascadia Mono" w:cs="Cascadia Mono"/>
+          <w:color w:val="000000"/>
+          <w:sz w:val="19"/>
+          <w:szCs w:val="19"/>
+          <w:highlight w:val="white"/>
+          <w:lang w:eastAsia="en-US"/>
+        </w:rPr>
+        <w:t xml:space="preserve"> = </w:t>
+      </w:r>
+      <w:proofErr w:type="spellStart"/>
+      <w:r>
+        <w:rPr>
+          <w:rFonts w:ascii="Cascadia Mono" w:hAnsi="Cascadia Mono" w:cs="Cascadia Mono"/>
+          <w:color w:val="000000"/>
+          <w:sz w:val="19"/>
+          <w:szCs w:val="19"/>
+          <w:highlight w:val="white"/>
+          <w:lang w:eastAsia="en-US"/>
+        </w:rPr>
+        <w:t>beforeActive</w:t>
+      </w:r>
+      <w:proofErr w:type="spellEnd"/>
+      <w:r>
+        <w:rPr>
+          <w:rFonts w:ascii="Cascadia Mono" w:hAnsi="Cascadia Mono" w:cs="Cascadia Mono"/>
+          <w:color w:val="000000"/>
+          <w:sz w:val="19"/>
+          <w:szCs w:val="19"/>
+          <w:highlight w:val="white"/>
+          <w:lang w:eastAsia="en-US"/>
+        </w:rPr>
+        <w:t xml:space="preserve"> - </w:t>
+      </w:r>
+      <w:proofErr w:type="spellStart"/>
+      <w:r>
+        <w:rPr>
+          <w:rFonts w:ascii="Cascadia Mono" w:hAnsi="Cascadia Mono" w:cs="Cascadia Mono"/>
+          <w:color w:val="000000"/>
+          <w:sz w:val="19"/>
+          <w:szCs w:val="19"/>
+          <w:highlight w:val="white"/>
+          <w:lang w:eastAsia="en-US"/>
+        </w:rPr>
+        <w:t>afterActive</w:t>
+      </w:r>
+      <w:proofErr w:type="spellEnd"/>
+      <w:r>
+        <w:rPr>
+          <w:rFonts w:ascii="Cascadia Mono" w:hAnsi="Cascadia Mono" w:cs="Cascadia Mono"/>
+          <w:color w:val="000000"/>
+          <w:sz w:val="19"/>
+          <w:szCs w:val="19"/>
+          <w:highlight w:val="white"/>
+          <w:lang w:eastAsia="en-US"/>
+        </w:rPr>
+        <w:t>;</w:t>
       </w:r>
     </w:p>
     <w:p>
@@ -4144,7 +5452,31 @@
           <w:highlight w:val="white"/>
           <w:lang w:eastAsia="en-US"/>
         </w:rPr>
-        <w:t xml:space="preserve"> (churnedRevenue &lt; 0) </w:t>
+        <w:t xml:space="preserve"> (</w:t>
+      </w:r>
+      <w:proofErr w:type="spellStart"/>
+      <w:r>
+        <w:rPr>
+          <w:rFonts w:ascii="Cascadia Mono" w:hAnsi="Cascadia Mono" w:cs="Cascadia Mono"/>
+          <w:color w:val="000000"/>
+          <w:sz w:val="19"/>
+          <w:szCs w:val="19"/>
+          <w:highlight w:val="white"/>
+          <w:lang w:eastAsia="en-US"/>
+        </w:rPr>
+        <w:t>churnedRevenue</w:t>
+      </w:r>
+      <w:proofErr w:type="spellEnd"/>
+      <w:r>
+        <w:rPr>
+          <w:rFonts w:ascii="Cascadia Mono" w:hAnsi="Cascadia Mono" w:cs="Cascadia Mono"/>
+          <w:color w:val="000000"/>
+          <w:sz w:val="19"/>
+          <w:szCs w:val="19"/>
+          <w:highlight w:val="white"/>
+          <w:lang w:eastAsia="en-US"/>
+        </w:rPr>
+        <w:t xml:space="preserve"> &lt; 0) </w:t>
       </w:r>
       <w:r>
         <w:rPr>
@@ -4189,7 +5521,30 @@
           <w:lang w:eastAsia="en-US"/>
         </w:rPr>
         <w:tab/>
-        <w:t>churnedRevenue = 0;</w:t>
+      </w:r>
+      <w:proofErr w:type="spellStart"/>
+      <w:r>
+        <w:rPr>
+          <w:rFonts w:ascii="Cascadia Mono" w:hAnsi="Cascadia Mono" w:cs="Cascadia Mono"/>
+          <w:color w:val="000000"/>
+          <w:sz w:val="19"/>
+          <w:szCs w:val="19"/>
+          <w:highlight w:val="white"/>
+          <w:lang w:eastAsia="en-US"/>
+        </w:rPr>
+        <w:t>churnedRevenue</w:t>
+      </w:r>
+      <w:proofErr w:type="spellEnd"/>
+      <w:r>
+        <w:rPr>
+          <w:rFonts w:ascii="Cascadia Mono" w:hAnsi="Cascadia Mono" w:cs="Cascadia Mono"/>
+          <w:color w:val="000000"/>
+          <w:sz w:val="19"/>
+          <w:szCs w:val="19"/>
+          <w:highlight w:val="white"/>
+          <w:lang w:eastAsia="en-US"/>
+        </w:rPr>
+        <w:t xml:space="preserve"> = 0;</w:t>
       </w:r>
     </w:p>
     <w:p>
@@ -4282,6 +5637,7 @@
         </w:rPr>
         <w:t xml:space="preserve"> </w:t>
       </w:r>
+      <w:proofErr w:type="spellStart"/>
       <w:r>
         <w:rPr>
           <w:rFonts w:ascii="Cascadia Mono" w:hAnsi="Cascadia Mono" w:cs="Cascadia Mono"/>
@@ -4293,16 +5649,65 @@
         </w:rPr>
         <w:t>RevenueSummary</w:t>
       </w:r>
-      <w:r>
-        <w:rPr>
-          <w:rFonts w:ascii="Cascadia Mono" w:hAnsi="Cascadia Mono" w:cs="Cascadia Mono"/>
-          <w:color w:val="000000"/>
-          <w:sz w:val="19"/>
-          <w:szCs w:val="19"/>
-          <w:highlight w:val="white"/>
-          <w:lang w:eastAsia="en-US"/>
-        </w:rPr>
-        <w:t>(afterActive, churnedRevenue);</w:t>
+      <w:proofErr w:type="spellEnd"/>
+      <w:r>
+        <w:rPr>
+          <w:rFonts w:ascii="Cascadia Mono" w:hAnsi="Cascadia Mono" w:cs="Cascadia Mono"/>
+          <w:color w:val="000000"/>
+          <w:sz w:val="19"/>
+          <w:szCs w:val="19"/>
+          <w:highlight w:val="white"/>
+          <w:lang w:eastAsia="en-US"/>
+        </w:rPr>
+        <w:t>(</w:t>
+      </w:r>
+      <w:proofErr w:type="spellStart"/>
+      <w:r>
+        <w:rPr>
+          <w:rFonts w:ascii="Cascadia Mono" w:hAnsi="Cascadia Mono" w:cs="Cascadia Mono"/>
+          <w:color w:val="000000"/>
+          <w:sz w:val="19"/>
+          <w:szCs w:val="19"/>
+          <w:highlight w:val="white"/>
+          <w:lang w:eastAsia="en-US"/>
+        </w:rPr>
+        <w:t>afterActive</w:t>
+      </w:r>
+      <w:proofErr w:type="spellEnd"/>
+      <w:r>
+        <w:rPr>
+          <w:rFonts w:ascii="Cascadia Mono" w:hAnsi="Cascadia Mono" w:cs="Cascadia Mono"/>
+          <w:color w:val="000000"/>
+          <w:sz w:val="19"/>
+          <w:szCs w:val="19"/>
+          <w:highlight w:val="white"/>
+          <w:lang w:eastAsia="en-US"/>
+        </w:rPr>
+        <w:t xml:space="preserve">, </w:t>
+      </w:r>
+      <w:proofErr w:type="spellStart"/>
+      <w:r>
+        <w:rPr>
+          <w:rFonts w:ascii="Cascadia Mono" w:hAnsi="Cascadia Mono" w:cs="Cascadia Mono"/>
+          <w:color w:val="000000"/>
+          <w:sz w:val="19"/>
+          <w:szCs w:val="19"/>
+          <w:highlight w:val="white"/>
+          <w:lang w:eastAsia="en-US"/>
+        </w:rPr>
+        <w:t>churnedRevenue</w:t>
+      </w:r>
+      <w:proofErr w:type="spellEnd"/>
+      <w:r>
+        <w:rPr>
+          <w:rFonts w:ascii="Cascadia Mono" w:hAnsi="Cascadia Mono" w:cs="Cascadia Mono"/>
+          <w:color w:val="000000"/>
+          <w:sz w:val="19"/>
+          <w:szCs w:val="19"/>
+          <w:highlight w:val="white"/>
+          <w:lang w:eastAsia="en-US"/>
+        </w:rPr>
+        <w:t>);</w:t>
       </w:r>
     </w:p>
     <w:p>
@@ -4381,6 +5786,7 @@
         <w:lastRenderedPageBreak/>
         <w:t xml:space="preserve">Update </w:t>
       </w:r>
+      <w:proofErr w:type="spellStart"/>
       <w:r>
         <w:rPr>
           <w:b/>
@@ -4389,6 +5795,7 @@
         </w:rPr>
         <w:t>Program.cs</w:t>
       </w:r>
+      <w:proofErr w:type="spellEnd"/>
       <w:r>
         <w:rPr>
           <w:b/>
@@ -4422,7 +5829,15 @@
         </w:rPr>
       </w:pPr>
       <w:r>
-        <w:t>Replace the default template (Program.cs) with:</w:t>
+        <w:t>Replace the default template (</w:t>
+      </w:r>
+      <w:proofErr w:type="spellStart"/>
+      <w:r>
+        <w:t>Program.cs</w:t>
+      </w:r>
+      <w:proofErr w:type="spellEnd"/>
+      <w:r>
+        <w:t>) with:</w:t>
       </w:r>
       <w:r>
         <w:br/>
@@ -4453,7 +5868,31 @@
           <w:highlight w:val="white"/>
           <w:lang w:eastAsia="en-US"/>
         </w:rPr>
-        <w:t xml:space="preserve"> SubscriptionMetrics.App;</w:t>
+        <w:t xml:space="preserve"> </w:t>
+      </w:r>
+      <w:proofErr w:type="spellStart"/>
+      <w:r>
+        <w:rPr>
+          <w:rFonts w:ascii="Cascadia Mono" w:hAnsi="Cascadia Mono" w:cs="Cascadia Mono"/>
+          <w:color w:val="000000"/>
+          <w:sz w:val="19"/>
+          <w:szCs w:val="19"/>
+          <w:highlight w:val="white"/>
+          <w:lang w:eastAsia="en-US"/>
+        </w:rPr>
+        <w:t>SubscriptionMetrics.App</w:t>
+      </w:r>
+      <w:proofErr w:type="spellEnd"/>
+      <w:r>
+        <w:rPr>
+          <w:rFonts w:ascii="Cascadia Mono" w:hAnsi="Cascadia Mono" w:cs="Cascadia Mono"/>
+          <w:color w:val="000000"/>
+          <w:sz w:val="19"/>
+          <w:szCs w:val="19"/>
+          <w:highlight w:val="white"/>
+          <w:lang w:eastAsia="en-US"/>
+        </w:rPr>
+        <w:t>;</w:t>
       </w:r>
     </w:p>
     <w:p>
@@ -4511,7 +5950,31 @@
           <w:highlight w:val="white"/>
           <w:lang w:eastAsia="en-US"/>
         </w:rPr>
-        <w:t xml:space="preserve"> lastMonth = </w:t>
+        <w:t xml:space="preserve"> </w:t>
+      </w:r>
+      <w:proofErr w:type="spellStart"/>
+      <w:r>
+        <w:rPr>
+          <w:rFonts w:ascii="Cascadia Mono" w:hAnsi="Cascadia Mono" w:cs="Cascadia Mono"/>
+          <w:color w:val="000000"/>
+          <w:sz w:val="19"/>
+          <w:szCs w:val="19"/>
+          <w:highlight w:val="white"/>
+          <w:lang w:eastAsia="en-US"/>
+        </w:rPr>
+        <w:t>lastMonth</w:t>
+      </w:r>
+      <w:proofErr w:type="spellEnd"/>
+      <w:r>
+        <w:rPr>
+          <w:rFonts w:ascii="Cascadia Mono" w:hAnsi="Cascadia Mono" w:cs="Cascadia Mono"/>
+          <w:color w:val="000000"/>
+          <w:sz w:val="19"/>
+          <w:szCs w:val="19"/>
+          <w:highlight w:val="white"/>
+          <w:lang w:eastAsia="en-US"/>
+        </w:rPr>
+        <w:t xml:space="preserve"> = </w:t>
       </w:r>
       <w:r>
         <w:rPr>
@@ -4613,7 +6076,31 @@
           <w:highlight w:val="white"/>
           <w:lang w:eastAsia="en-US"/>
         </w:rPr>
-        <w:t xml:space="preserve"> CustomerSubscription(</w:t>
+        <w:t xml:space="preserve"> </w:t>
+      </w:r>
+      <w:proofErr w:type="spellStart"/>
+      <w:r>
+        <w:rPr>
+          <w:rFonts w:ascii="Cascadia Mono" w:hAnsi="Cascadia Mono" w:cs="Cascadia Mono"/>
+          <w:color w:val="000000"/>
+          <w:sz w:val="19"/>
+          <w:szCs w:val="19"/>
+          <w:highlight w:val="white"/>
+          <w:lang w:eastAsia="en-US"/>
+        </w:rPr>
+        <w:t>CustomerSubscription</w:t>
+      </w:r>
+      <w:proofErr w:type="spellEnd"/>
+      <w:r>
+        <w:rPr>
+          <w:rFonts w:ascii="Cascadia Mono" w:hAnsi="Cascadia Mono" w:cs="Cascadia Mono"/>
+          <w:color w:val="000000"/>
+          <w:sz w:val="19"/>
+          <w:szCs w:val="19"/>
+          <w:highlight w:val="white"/>
+          <w:lang w:eastAsia="en-US"/>
+        </w:rPr>
+        <w:t>(</w:t>
       </w:r>
       <w:r>
         <w:rPr>
@@ -4708,7 +6195,31 @@
           <w:highlight w:val="white"/>
           <w:lang w:eastAsia="en-US"/>
         </w:rPr>
-        <w:t xml:space="preserve"> CustomerSubscription(</w:t>
+        <w:t xml:space="preserve"> </w:t>
+      </w:r>
+      <w:proofErr w:type="spellStart"/>
+      <w:r>
+        <w:rPr>
+          <w:rFonts w:ascii="Cascadia Mono" w:hAnsi="Cascadia Mono" w:cs="Cascadia Mono"/>
+          <w:color w:val="000000"/>
+          <w:sz w:val="19"/>
+          <w:szCs w:val="19"/>
+          <w:highlight w:val="white"/>
+          <w:lang w:eastAsia="en-US"/>
+        </w:rPr>
+        <w:t>CustomerSubscription</w:t>
+      </w:r>
+      <w:proofErr w:type="spellEnd"/>
+      <w:r>
+        <w:rPr>
+          <w:rFonts w:ascii="Cascadia Mono" w:hAnsi="Cascadia Mono" w:cs="Cascadia Mono"/>
+          <w:color w:val="000000"/>
+          <w:sz w:val="19"/>
+          <w:szCs w:val="19"/>
+          <w:highlight w:val="white"/>
+          <w:lang w:eastAsia="en-US"/>
+        </w:rPr>
+        <w:t>(</w:t>
       </w:r>
       <w:r>
         <w:rPr>
@@ -4803,7 +6314,31 @@
           <w:highlight w:val="white"/>
           <w:lang w:eastAsia="en-US"/>
         </w:rPr>
-        <w:t xml:space="preserve"> CustomerSubscription(</w:t>
+        <w:t xml:space="preserve"> </w:t>
+      </w:r>
+      <w:proofErr w:type="spellStart"/>
+      <w:r>
+        <w:rPr>
+          <w:rFonts w:ascii="Cascadia Mono" w:hAnsi="Cascadia Mono" w:cs="Cascadia Mono"/>
+          <w:color w:val="000000"/>
+          <w:sz w:val="19"/>
+          <w:szCs w:val="19"/>
+          <w:highlight w:val="white"/>
+          <w:lang w:eastAsia="en-US"/>
+        </w:rPr>
+        <w:t>CustomerSubscription</w:t>
+      </w:r>
+      <w:proofErr w:type="spellEnd"/>
+      <w:r>
+        <w:rPr>
+          <w:rFonts w:ascii="Cascadia Mono" w:hAnsi="Cascadia Mono" w:cs="Cascadia Mono"/>
+          <w:color w:val="000000"/>
+          <w:sz w:val="19"/>
+          <w:szCs w:val="19"/>
+          <w:highlight w:val="white"/>
+          <w:lang w:eastAsia="en-US"/>
+        </w:rPr>
+        <w:t>(</w:t>
       </w:r>
       <w:r>
         <w:rPr>
@@ -4934,7 +6469,31 @@
           <w:highlight w:val="white"/>
           <w:lang w:eastAsia="en-US"/>
         </w:rPr>
-        <w:t xml:space="preserve"> thisMonth = </w:t>
+        <w:t xml:space="preserve"> </w:t>
+      </w:r>
+      <w:proofErr w:type="spellStart"/>
+      <w:r>
+        <w:rPr>
+          <w:rFonts w:ascii="Cascadia Mono" w:hAnsi="Cascadia Mono" w:cs="Cascadia Mono"/>
+          <w:color w:val="000000"/>
+          <w:sz w:val="19"/>
+          <w:szCs w:val="19"/>
+          <w:highlight w:val="white"/>
+          <w:lang w:eastAsia="en-US"/>
+        </w:rPr>
+        <w:t>thisMonth</w:t>
+      </w:r>
+      <w:proofErr w:type="spellEnd"/>
+      <w:r>
+        <w:rPr>
+          <w:rFonts w:ascii="Cascadia Mono" w:hAnsi="Cascadia Mono" w:cs="Cascadia Mono"/>
+          <w:color w:val="000000"/>
+          <w:sz w:val="19"/>
+          <w:szCs w:val="19"/>
+          <w:highlight w:val="white"/>
+          <w:lang w:eastAsia="en-US"/>
+        </w:rPr>
+        <w:t xml:space="preserve"> = </w:t>
       </w:r>
       <w:r>
         <w:rPr>
@@ -5036,7 +6595,31 @@
           <w:highlight w:val="white"/>
           <w:lang w:eastAsia="en-US"/>
         </w:rPr>
-        <w:t xml:space="preserve"> CustomerSubscription(</w:t>
+        <w:t xml:space="preserve"> </w:t>
+      </w:r>
+      <w:proofErr w:type="spellStart"/>
+      <w:r>
+        <w:rPr>
+          <w:rFonts w:ascii="Cascadia Mono" w:hAnsi="Cascadia Mono" w:cs="Cascadia Mono"/>
+          <w:color w:val="000000"/>
+          <w:sz w:val="19"/>
+          <w:szCs w:val="19"/>
+          <w:highlight w:val="white"/>
+          <w:lang w:eastAsia="en-US"/>
+        </w:rPr>
+        <w:t>CustomerSubscription</w:t>
+      </w:r>
+      <w:proofErr w:type="spellEnd"/>
+      <w:r>
+        <w:rPr>
+          <w:rFonts w:ascii="Cascadia Mono" w:hAnsi="Cascadia Mono" w:cs="Cascadia Mono"/>
+          <w:color w:val="000000"/>
+          <w:sz w:val="19"/>
+          <w:szCs w:val="19"/>
+          <w:highlight w:val="white"/>
+          <w:lang w:eastAsia="en-US"/>
+        </w:rPr>
+        <w:t>(</w:t>
       </w:r>
       <w:r>
         <w:rPr>
@@ -5131,7 +6714,31 @@
           <w:highlight w:val="white"/>
           <w:lang w:eastAsia="en-US"/>
         </w:rPr>
-        <w:t xml:space="preserve"> CustomerSubscription(</w:t>
+        <w:t xml:space="preserve"> </w:t>
+      </w:r>
+      <w:proofErr w:type="spellStart"/>
+      <w:r>
+        <w:rPr>
+          <w:rFonts w:ascii="Cascadia Mono" w:hAnsi="Cascadia Mono" w:cs="Cascadia Mono"/>
+          <w:color w:val="000000"/>
+          <w:sz w:val="19"/>
+          <w:szCs w:val="19"/>
+          <w:highlight w:val="white"/>
+          <w:lang w:eastAsia="en-US"/>
+        </w:rPr>
+        <w:t>CustomerSubscription</w:t>
+      </w:r>
+      <w:proofErr w:type="spellEnd"/>
+      <w:r>
+        <w:rPr>
+          <w:rFonts w:ascii="Cascadia Mono" w:hAnsi="Cascadia Mono" w:cs="Cascadia Mono"/>
+          <w:color w:val="000000"/>
+          <w:sz w:val="19"/>
+          <w:szCs w:val="19"/>
+          <w:highlight w:val="white"/>
+          <w:lang w:eastAsia="en-US"/>
+        </w:rPr>
+        <w:t>(</w:t>
       </w:r>
       <w:r>
         <w:rPr>
@@ -5237,7 +6844,31 @@
           <w:highlight w:val="white"/>
           <w:lang w:eastAsia="en-US"/>
         </w:rPr>
-        <w:t xml:space="preserve"> CustomerSubscription(</w:t>
+        <w:t xml:space="preserve"> </w:t>
+      </w:r>
+      <w:proofErr w:type="spellStart"/>
+      <w:r>
+        <w:rPr>
+          <w:rFonts w:ascii="Cascadia Mono" w:hAnsi="Cascadia Mono" w:cs="Cascadia Mono"/>
+          <w:color w:val="000000"/>
+          <w:sz w:val="19"/>
+          <w:szCs w:val="19"/>
+          <w:highlight w:val="white"/>
+          <w:lang w:eastAsia="en-US"/>
+        </w:rPr>
+        <w:t>CustomerSubscription</w:t>
+      </w:r>
+      <w:proofErr w:type="spellEnd"/>
+      <w:r>
+        <w:rPr>
+          <w:rFonts w:ascii="Cascadia Mono" w:hAnsi="Cascadia Mono" w:cs="Cascadia Mono"/>
+          <w:color w:val="000000"/>
+          <w:sz w:val="19"/>
+          <w:szCs w:val="19"/>
+          <w:highlight w:val="white"/>
+          <w:lang w:eastAsia="en-US"/>
+        </w:rPr>
+        <w:t>(</w:t>
       </w:r>
       <w:r>
         <w:rPr>
@@ -5379,7 +7010,79 @@
           <w:highlight w:val="white"/>
           <w:lang w:eastAsia="en-US"/>
         </w:rPr>
-        <w:t xml:space="preserve"> summary = RevenueCalculator.Calculate(lastMonth, thisMonth);</w:t>
+        <w:t xml:space="preserve"> summary = </w:t>
+      </w:r>
+      <w:proofErr w:type="spellStart"/>
+      <w:r>
+        <w:rPr>
+          <w:rFonts w:ascii="Cascadia Mono" w:hAnsi="Cascadia Mono" w:cs="Cascadia Mono"/>
+          <w:color w:val="000000"/>
+          <w:sz w:val="19"/>
+          <w:szCs w:val="19"/>
+          <w:highlight w:val="white"/>
+          <w:lang w:eastAsia="en-US"/>
+        </w:rPr>
+        <w:t>RevenueCalculator.Calculate</w:t>
+      </w:r>
+      <w:proofErr w:type="spellEnd"/>
+      <w:r>
+        <w:rPr>
+          <w:rFonts w:ascii="Cascadia Mono" w:hAnsi="Cascadia Mono" w:cs="Cascadia Mono"/>
+          <w:color w:val="000000"/>
+          <w:sz w:val="19"/>
+          <w:szCs w:val="19"/>
+          <w:highlight w:val="white"/>
+          <w:lang w:eastAsia="en-US"/>
+        </w:rPr>
+        <w:t>(</w:t>
+      </w:r>
+      <w:proofErr w:type="spellStart"/>
+      <w:r>
+        <w:rPr>
+          <w:rFonts w:ascii="Cascadia Mono" w:hAnsi="Cascadia Mono" w:cs="Cascadia Mono"/>
+          <w:color w:val="000000"/>
+          <w:sz w:val="19"/>
+          <w:szCs w:val="19"/>
+          <w:highlight w:val="white"/>
+          <w:lang w:eastAsia="en-US"/>
+        </w:rPr>
+        <w:t>lastMonth</w:t>
+      </w:r>
+      <w:proofErr w:type="spellEnd"/>
+      <w:r>
+        <w:rPr>
+          <w:rFonts w:ascii="Cascadia Mono" w:hAnsi="Cascadia Mono" w:cs="Cascadia Mono"/>
+          <w:color w:val="000000"/>
+          <w:sz w:val="19"/>
+          <w:szCs w:val="19"/>
+          <w:highlight w:val="white"/>
+          <w:lang w:eastAsia="en-US"/>
+        </w:rPr>
+        <w:t xml:space="preserve">, </w:t>
+      </w:r>
+      <w:proofErr w:type="spellStart"/>
+      <w:r>
+        <w:rPr>
+          <w:rFonts w:ascii="Cascadia Mono" w:hAnsi="Cascadia Mono" w:cs="Cascadia Mono"/>
+          <w:color w:val="000000"/>
+          <w:sz w:val="19"/>
+          <w:szCs w:val="19"/>
+          <w:highlight w:val="white"/>
+          <w:lang w:eastAsia="en-US"/>
+        </w:rPr>
+        <w:t>thisMonth</w:t>
+      </w:r>
+      <w:proofErr w:type="spellEnd"/>
+      <w:r>
+        <w:rPr>
+          <w:rFonts w:ascii="Cascadia Mono" w:hAnsi="Cascadia Mono" w:cs="Cascadia Mono"/>
+          <w:color w:val="000000"/>
+          <w:sz w:val="19"/>
+          <w:szCs w:val="19"/>
+          <w:highlight w:val="white"/>
+          <w:lang w:eastAsia="en-US"/>
+        </w:rPr>
+        <w:t>);</w:t>
       </w:r>
     </w:p>
     <w:p>
@@ -5417,6 +7120,7 @@
           <w:lang w:eastAsia="en-US"/>
         </w:rPr>
       </w:pPr>
+      <w:proofErr w:type="spellStart"/>
       <w:r>
         <w:rPr>
           <w:rFonts w:ascii="Cascadia Mono" w:hAnsi="Cascadia Mono" w:cs="Cascadia Mono"/>
@@ -5437,7 +7141,19 @@
           <w:highlight w:val="white"/>
           <w:lang w:eastAsia="en-US"/>
         </w:rPr>
-        <w:t>.WriteLine(</w:t>
+        <w:t>.WriteLine</w:t>
+      </w:r>
+      <w:proofErr w:type="spellEnd"/>
+      <w:r>
+        <w:rPr>
+          <w:rFonts w:ascii="Cascadia Mono" w:hAnsi="Cascadia Mono" w:cs="Cascadia Mono"/>
+          <w:color w:val="000000"/>
+          <w:sz w:val="19"/>
+          <w:szCs w:val="19"/>
+          <w:highlight w:val="white"/>
+          <w:lang w:eastAsia="en-US"/>
+        </w:rPr>
+        <w:t>(</w:t>
       </w:r>
       <w:r>
         <w:rPr>
@@ -5479,6 +7195,7 @@
           <w:lang w:eastAsia="en-US"/>
         </w:rPr>
       </w:pPr>
+      <w:proofErr w:type="spellStart"/>
       <w:r>
         <w:rPr>
           <w:rFonts w:ascii="Cascadia Mono" w:hAnsi="Cascadia Mono" w:cs="Cascadia Mono"/>
@@ -5499,7 +7216,19 @@
           <w:highlight w:val="white"/>
           <w:lang w:eastAsia="en-US"/>
         </w:rPr>
-        <w:t>.WriteLine(</w:t>
+        <w:t>.WriteLine</w:t>
+      </w:r>
+      <w:proofErr w:type="spellEnd"/>
+      <w:r>
+        <w:rPr>
+          <w:rFonts w:ascii="Cascadia Mono" w:hAnsi="Cascadia Mono" w:cs="Cascadia Mono"/>
+          <w:color w:val="000000"/>
+          <w:sz w:val="19"/>
+          <w:szCs w:val="19"/>
+          <w:highlight w:val="white"/>
+          <w:lang w:eastAsia="en-US"/>
+        </w:rPr>
+        <w:t>(</w:t>
       </w:r>
       <w:r>
         <w:rPr>
@@ -5541,6 +7270,7 @@
           <w:lang w:eastAsia="en-US"/>
         </w:rPr>
       </w:pPr>
+      <w:proofErr w:type="spellStart"/>
       <w:r>
         <w:rPr>
           <w:rFonts w:ascii="Cascadia Mono" w:hAnsi="Cascadia Mono" w:cs="Cascadia Mono"/>
@@ -5561,7 +7291,19 @@
           <w:highlight w:val="white"/>
           <w:lang w:eastAsia="en-US"/>
         </w:rPr>
-        <w:t>.WriteLine(</w:t>
+        <w:t>.WriteLine</w:t>
+      </w:r>
+      <w:proofErr w:type="spellEnd"/>
+      <w:r>
+        <w:rPr>
+          <w:rFonts w:ascii="Cascadia Mono" w:hAnsi="Cascadia Mono" w:cs="Cascadia Mono"/>
+          <w:color w:val="000000"/>
+          <w:sz w:val="19"/>
+          <w:szCs w:val="19"/>
+          <w:highlight w:val="white"/>
+          <w:lang w:eastAsia="en-US"/>
+        </w:rPr>
+        <w:t>(</w:t>
       </w:r>
       <w:r>
         <w:rPr>
@@ -5583,7 +7325,19 @@
           <w:highlight w:val="white"/>
           <w:lang w:eastAsia="en-US"/>
         </w:rPr>
-        <w:t>{summary.ActiveMrr:</w:t>
+        <w:t>{</w:t>
+      </w:r>
+      <w:proofErr w:type="spellStart"/>
+      <w:r>
+        <w:rPr>
+          <w:rFonts w:ascii="Cascadia Mono" w:hAnsi="Cascadia Mono" w:cs="Cascadia Mono"/>
+          <w:color w:val="000000"/>
+          <w:sz w:val="19"/>
+          <w:szCs w:val="19"/>
+          <w:highlight w:val="white"/>
+          <w:lang w:eastAsia="en-US"/>
+        </w:rPr>
+        <w:t>summary.ActiveMrr:</w:t>
       </w:r>
       <w:r>
         <w:rPr>
@@ -5596,6 +7350,7 @@
         </w:rPr>
         <w:t>C</w:t>
       </w:r>
+      <w:proofErr w:type="spellEnd"/>
       <w:r>
         <w:rPr>
           <w:rFonts w:ascii="Cascadia Mono" w:hAnsi="Cascadia Mono" w:cs="Cascadia Mono"/>
@@ -5647,6 +7402,7 @@
           <w:lang w:eastAsia="en-US"/>
         </w:rPr>
       </w:pPr>
+      <w:proofErr w:type="spellStart"/>
       <w:r>
         <w:rPr>
           <w:rFonts w:ascii="Cascadia Mono" w:hAnsi="Cascadia Mono" w:cs="Cascadia Mono"/>
@@ -5667,7 +7423,19 @@
           <w:highlight w:val="white"/>
           <w:lang w:eastAsia="en-US"/>
         </w:rPr>
-        <w:t>.WriteLine(</w:t>
+        <w:t>.WriteLine</w:t>
+      </w:r>
+      <w:proofErr w:type="spellEnd"/>
+      <w:r>
+        <w:rPr>
+          <w:rFonts w:ascii="Cascadia Mono" w:hAnsi="Cascadia Mono" w:cs="Cascadia Mono"/>
+          <w:color w:val="000000"/>
+          <w:sz w:val="19"/>
+          <w:szCs w:val="19"/>
+          <w:highlight w:val="white"/>
+          <w:lang w:eastAsia="en-US"/>
+        </w:rPr>
+        <w:t>(</w:t>
       </w:r>
       <w:r>
         <w:rPr>
@@ -5689,7 +7457,19 @@
           <w:highlight w:val="white"/>
           <w:lang w:eastAsia="en-US"/>
         </w:rPr>
-        <w:t>{summary.ChurnedRevenue:</w:t>
+        <w:t>{</w:t>
+      </w:r>
+      <w:proofErr w:type="spellStart"/>
+      <w:r>
+        <w:rPr>
+          <w:rFonts w:ascii="Cascadia Mono" w:hAnsi="Cascadia Mono" w:cs="Cascadia Mono"/>
+          <w:color w:val="000000"/>
+          <w:sz w:val="19"/>
+          <w:szCs w:val="19"/>
+          <w:highlight w:val="white"/>
+          <w:lang w:eastAsia="en-US"/>
+        </w:rPr>
+        <w:t>summary.ChurnedRevenue:</w:t>
       </w:r>
       <w:r>
         <w:rPr>
@@ -5702,6 +7482,7 @@
         </w:rPr>
         <w:t>C</w:t>
       </w:r>
+      <w:proofErr w:type="spellEnd"/>
       <w:r>
         <w:rPr>
           <w:rFonts w:ascii="Cascadia Mono" w:hAnsi="Cascadia Mono" w:cs="Cascadia Mono"/>
@@ -5753,6 +7534,7 @@
           <w:lang w:eastAsia="en-US"/>
         </w:rPr>
       </w:pPr>
+      <w:proofErr w:type="spellStart"/>
       <w:r>
         <w:rPr>
           <w:rFonts w:ascii="Cascadia Mono" w:hAnsi="Cascadia Mono" w:cs="Cascadia Mono"/>
@@ -5773,7 +7555,19 @@
           <w:highlight w:val="white"/>
           <w:lang w:eastAsia="en-US"/>
         </w:rPr>
-        <w:t>.WriteLine(</w:t>
+        <w:t>.WriteLine</w:t>
+      </w:r>
+      <w:proofErr w:type="spellEnd"/>
+      <w:r>
+        <w:rPr>
+          <w:rFonts w:ascii="Cascadia Mono" w:hAnsi="Cascadia Mono" w:cs="Cascadia Mono"/>
+          <w:color w:val="000000"/>
+          <w:sz w:val="19"/>
+          <w:szCs w:val="19"/>
+          <w:highlight w:val="white"/>
+          <w:lang w:eastAsia="en-US"/>
+        </w:rPr>
+        <w:t>(</w:t>
       </w:r>
       <w:r>
         <w:rPr>
@@ -5795,7 +7589,19 @@
           <w:highlight w:val="white"/>
           <w:lang w:eastAsia="en-US"/>
         </w:rPr>
-        <w:t>{summary.NetMrr:</w:t>
+        <w:t>{</w:t>
+      </w:r>
+      <w:proofErr w:type="spellStart"/>
+      <w:r>
+        <w:rPr>
+          <w:rFonts w:ascii="Cascadia Mono" w:hAnsi="Cascadia Mono" w:cs="Cascadia Mono"/>
+          <w:color w:val="000000"/>
+          <w:sz w:val="19"/>
+          <w:szCs w:val="19"/>
+          <w:highlight w:val="white"/>
+          <w:lang w:eastAsia="en-US"/>
+        </w:rPr>
+        <w:t>summary.NetMrr:</w:t>
       </w:r>
       <w:r>
         <w:rPr>
@@ -5808,6 +7614,7 @@
         </w:rPr>
         <w:t>C</w:t>
       </w:r>
+      <w:proofErr w:type="spellEnd"/>
       <w:r>
         <w:rPr>
           <w:rFonts w:ascii="Cascadia Mono" w:hAnsi="Cascadia Mono" w:cs="Cascadia Mono"/>
@@ -5903,6 +7710,7 @@
         </w:rPr>
         <w:t xml:space="preserve">cd </w:t>
       </w:r>
+      <w:proofErr w:type="spellStart"/>
       <w:r>
         <w:rPr>
           <w:rFonts w:ascii="Courier New" w:hAnsi="Courier New" w:cs="Courier New"/>
@@ -5913,6 +7721,7 @@
         </w:rPr>
         <w:t>SubscriptionMetrics.App</w:t>
       </w:r>
+      <w:proofErr w:type="spellEnd"/>
     </w:p>
     <w:p>
       <w:pPr>
@@ -6094,8 +7903,36 @@
           <w:b/>
           <w:bCs/>
         </w:rPr>
-        <w:t>new xunit -n SubscriptionMetrics.Tests</w:t>
-      </w:r>
+        <w:t xml:space="preserve">new </w:t>
+      </w:r>
+      <w:proofErr w:type="spellStart"/>
+      <w:r>
+        <w:rPr>
+          <w:rFonts w:ascii="Courier New" w:hAnsi="Courier New" w:cs="Courier New"/>
+          <w:b/>
+          <w:bCs/>
+        </w:rPr>
+        <w:t>xunit</w:t>
+      </w:r>
+      <w:proofErr w:type="spellEnd"/>
+      <w:r>
+        <w:rPr>
+          <w:rFonts w:ascii="Courier New" w:hAnsi="Courier New" w:cs="Courier New"/>
+          <w:b/>
+          <w:bCs/>
+        </w:rPr>
+        <w:t xml:space="preserve"> -n </w:t>
+      </w:r>
+      <w:proofErr w:type="spellStart"/>
+      <w:r>
+        <w:rPr>
+          <w:rFonts w:ascii="Courier New" w:hAnsi="Courier New" w:cs="Courier New"/>
+          <w:b/>
+          <w:bCs/>
+        </w:rPr>
+        <w:t>SubscriptionMetrics.Tests</w:t>
+      </w:r>
+      <w:proofErr w:type="spellEnd"/>
     </w:p>
     <w:p>
       <w:pPr>
@@ -6116,16 +7953,54 @@
           <w:b/>
           <w:bCs/>
         </w:rPr>
-        <w:t xml:space="preserve"> sln add </w:t>
-      </w:r>
+        <w:t xml:space="preserve"> </w:t>
+      </w:r>
+      <w:proofErr w:type="spellStart"/>
+      <w:r>
+        <w:rPr>
+          <w:rFonts w:ascii="Courier New" w:hAnsi="Courier New" w:cs="Courier New"/>
+          <w:b/>
+          <w:bCs/>
+        </w:rPr>
+        <w:t>sln</w:t>
+      </w:r>
+      <w:proofErr w:type="spellEnd"/>
+      <w:r>
+        <w:rPr>
+          <w:rFonts w:ascii="Courier New" w:hAnsi="Courier New" w:cs="Courier New"/>
+          <w:b/>
+          <w:bCs/>
+        </w:rPr>
+        <w:t xml:space="preserve"> add </w:t>
+      </w:r>
+      <w:proofErr w:type="spellStart"/>
       <w:r>
         <w:rPr>
           <w:rFonts w:ascii="Courier New" w:hAnsi="Courier New" w:cs="Courier New"/>
           <w:sz w:val="16"/>
           <w:szCs w:val="16"/>
         </w:rPr>
-        <w:t>SubscriptionMetrics.Tests/SubscriptionMetrics.Tests.csproj</w:t>
-      </w:r>
+        <w:t>SubscriptionMetrics.Tests</w:t>
+      </w:r>
+      <w:proofErr w:type="spellEnd"/>
+      <w:r>
+        <w:rPr>
+          <w:rFonts w:ascii="Courier New" w:hAnsi="Courier New" w:cs="Courier New"/>
+          <w:sz w:val="16"/>
+          <w:szCs w:val="16"/>
+        </w:rPr>
+        <w:t>/</w:t>
+      </w:r>
+      <w:proofErr w:type="spellStart"/>
+      <w:r>
+        <w:rPr>
+          <w:rFonts w:ascii="Courier New" w:hAnsi="Courier New" w:cs="Courier New"/>
+          <w:sz w:val="16"/>
+          <w:szCs w:val="16"/>
+        </w:rPr>
+        <w:t>SubscriptionMetrics.Tests.csproj</w:t>
+      </w:r>
+      <w:proofErr w:type="spellEnd"/>
       <w:r>
         <w:rPr>
           <w:rFonts w:ascii="Courier New" w:hAnsi="Courier New" w:cs="Courier New"/>
@@ -6218,13 +8093,70 @@
           <w:sz w:val="24"/>
           <w:szCs w:val="24"/>
         </w:rPr>
-        <w:t xml:space="preserve"> SubscriptionMetrics.Tests/SubscriptionMetrics.Tests.csproj reference SubscriptionMetrics.App/SubscriptionMetrics.App.csproj</w:t>
-      </w:r>
+        <w:t xml:space="preserve"> </w:t>
+      </w:r>
+      <w:proofErr w:type="spellStart"/>
       <w:r>
         <w:rPr>
           <w:sz w:val="24"/>
           <w:szCs w:val="24"/>
         </w:rPr>
+        <w:t>SubscriptionMetrics.Tests</w:t>
+      </w:r>
+      <w:proofErr w:type="spellEnd"/>
+      <w:r>
+        <w:rPr>
+          <w:sz w:val="24"/>
+          <w:szCs w:val="24"/>
+        </w:rPr>
+        <w:t>/</w:t>
+      </w:r>
+      <w:proofErr w:type="spellStart"/>
+      <w:r>
+        <w:rPr>
+          <w:sz w:val="24"/>
+          <w:szCs w:val="24"/>
+        </w:rPr>
+        <w:t>SubscriptionMetrics.Tests.csproj</w:t>
+      </w:r>
+      <w:proofErr w:type="spellEnd"/>
+      <w:r>
+        <w:rPr>
+          <w:sz w:val="24"/>
+          <w:szCs w:val="24"/>
+        </w:rPr>
+        <w:t xml:space="preserve"> reference </w:t>
+      </w:r>
+      <w:proofErr w:type="spellStart"/>
+      <w:r>
+        <w:rPr>
+          <w:sz w:val="24"/>
+          <w:szCs w:val="24"/>
+        </w:rPr>
+        <w:t>SubscriptionMetrics.App</w:t>
+      </w:r>
+      <w:proofErr w:type="spellEnd"/>
+      <w:r>
+        <w:rPr>
+          <w:sz w:val="24"/>
+          <w:szCs w:val="24"/>
+        </w:rPr>
+        <w:t>/</w:t>
+      </w:r>
+      <w:proofErr w:type="spellStart"/>
+      <w:r>
+        <w:rPr>
+          <w:sz w:val="24"/>
+          <w:szCs w:val="24"/>
+        </w:rPr>
+        <w:t>SubscriptionMetrics.App.csproj</w:t>
+      </w:r>
+      <w:proofErr w:type="spellEnd"/>
+      <w:r>
+        <w:rPr>
+          <w:sz w:val="24"/>
+          <w:szCs w:val="24"/>
+        </w:rPr>
         <w:br/>
       </w:r>
       <w:r>
@@ -6278,13 +8210,31 @@
       <w:r>
         <w:t xml:space="preserve">In </w:t>
       </w:r>
-      <w:r>
-        <w:rPr>
-          <w:b/>
-          <w:bCs/>
-        </w:rPr>
-        <w:t>SubscriptionMetrics.Tests/RevenueCalculatorTests.cs</w:t>
-      </w:r>
+      <w:proofErr w:type="spellStart"/>
+      <w:r>
+        <w:rPr>
+          <w:b/>
+          <w:bCs/>
+        </w:rPr>
+        <w:t>SubscriptionMetrics.Tests</w:t>
+      </w:r>
+      <w:proofErr w:type="spellEnd"/>
+      <w:r>
+        <w:rPr>
+          <w:b/>
+          <w:bCs/>
+        </w:rPr>
+        <w:t>/</w:t>
+      </w:r>
+      <w:proofErr w:type="spellStart"/>
+      <w:r>
+        <w:rPr>
+          <w:b/>
+          <w:bCs/>
+        </w:rPr>
+        <w:t>RevenueCalculatorTests.cs</w:t>
+      </w:r>
+      <w:proofErr w:type="spellEnd"/>
       <w:r>
         <w:t>:</w:t>
       </w:r>
@@ -6329,7 +8279,31 @@
           <w:highlight w:val="white"/>
           <w:lang w:eastAsia="en-US"/>
         </w:rPr>
-        <w:t xml:space="preserve"> SubscriptionMetrics.App;</w:t>
+        <w:t xml:space="preserve"> </w:t>
+      </w:r>
+      <w:proofErr w:type="spellStart"/>
+      <w:r>
+        <w:rPr>
+          <w:rFonts w:ascii="Cascadia Mono" w:hAnsi="Cascadia Mono" w:cs="Cascadia Mono"/>
+          <w:color w:val="000000"/>
+          <w:sz w:val="19"/>
+          <w:szCs w:val="19"/>
+          <w:highlight w:val="white"/>
+          <w:lang w:eastAsia="en-US"/>
+        </w:rPr>
+        <w:t>SubscriptionMetrics.App</w:t>
+      </w:r>
+      <w:proofErr w:type="spellEnd"/>
+      <w:r>
+        <w:rPr>
+          <w:rFonts w:ascii="Cascadia Mono" w:hAnsi="Cascadia Mono" w:cs="Cascadia Mono"/>
+          <w:color w:val="000000"/>
+          <w:sz w:val="19"/>
+          <w:szCs w:val="19"/>
+          <w:highlight w:val="white"/>
+          <w:lang w:eastAsia="en-US"/>
+        </w:rPr>
+        <w:t>;</w:t>
       </w:r>
     </w:p>
     <w:p>
@@ -6387,7 +8361,31 @@
           <w:highlight w:val="white"/>
           <w:lang w:eastAsia="en-US"/>
         </w:rPr>
-        <w:t xml:space="preserve"> SubscriptionMetrics.Tests;</w:t>
+        <w:t xml:space="preserve"> </w:t>
+      </w:r>
+      <w:proofErr w:type="spellStart"/>
+      <w:r>
+        <w:rPr>
+          <w:rFonts w:ascii="Cascadia Mono" w:hAnsi="Cascadia Mono" w:cs="Cascadia Mono"/>
+          <w:color w:val="000000"/>
+          <w:sz w:val="19"/>
+          <w:szCs w:val="19"/>
+          <w:highlight w:val="white"/>
+          <w:lang w:eastAsia="en-US"/>
+        </w:rPr>
+        <w:t>SubscriptionMetrics.Tests</w:t>
+      </w:r>
+      <w:proofErr w:type="spellEnd"/>
+      <w:r>
+        <w:rPr>
+          <w:rFonts w:ascii="Cascadia Mono" w:hAnsi="Cascadia Mono" w:cs="Cascadia Mono"/>
+          <w:color w:val="000000"/>
+          <w:sz w:val="19"/>
+          <w:szCs w:val="19"/>
+          <w:highlight w:val="white"/>
+          <w:lang w:eastAsia="en-US"/>
+        </w:rPr>
+        <w:t>;</w:t>
       </w:r>
     </w:p>
     <w:p>
@@ -6469,6 +8467,7 @@
         </w:rPr>
         <w:t xml:space="preserve"> </w:t>
       </w:r>
+      <w:proofErr w:type="spellStart"/>
       <w:r>
         <w:rPr>
           <w:rFonts w:ascii="Cascadia Mono" w:hAnsi="Cascadia Mono" w:cs="Cascadia Mono"/>
@@ -6480,6 +8479,7 @@
         </w:rPr>
         <w:t>RevenueCalculatorTests</w:t>
       </w:r>
+      <w:proofErr w:type="spellEnd"/>
     </w:p>
     <w:p>
       <w:pPr>
@@ -6609,7 +8609,31 @@
           <w:highlight w:val="white"/>
           <w:lang w:eastAsia="en-US"/>
         </w:rPr>
-        <w:t xml:space="preserve"> Calculate_ReturnsCorrectActiveMrrAndChurn()</w:t>
+        <w:t xml:space="preserve"> </w:t>
+      </w:r>
+      <w:proofErr w:type="spellStart"/>
+      <w:r>
+        <w:rPr>
+          <w:rFonts w:ascii="Cascadia Mono" w:hAnsi="Cascadia Mono" w:cs="Cascadia Mono"/>
+          <w:color w:val="000000"/>
+          <w:sz w:val="19"/>
+          <w:szCs w:val="19"/>
+          <w:highlight w:val="white"/>
+          <w:lang w:eastAsia="en-US"/>
+        </w:rPr>
+        <w:t>Calculate_ReturnsCorrectActiveMrrAndChurn</w:t>
+      </w:r>
+      <w:proofErr w:type="spellEnd"/>
+      <w:r>
+        <w:rPr>
+          <w:rFonts w:ascii="Cascadia Mono" w:hAnsi="Cascadia Mono" w:cs="Cascadia Mono"/>
+          <w:color w:val="000000"/>
+          <w:sz w:val="19"/>
+          <w:szCs w:val="19"/>
+          <w:highlight w:val="white"/>
+          <w:lang w:eastAsia="en-US"/>
+        </w:rPr>
+        <w:t>()</w:t>
       </w:r>
     </w:p>
     <w:p>
@@ -6689,7 +8713,31 @@
           <w:highlight w:val="white"/>
           <w:lang w:eastAsia="en-US"/>
         </w:rPr>
-        <w:t xml:space="preserve"> lastMonth = </w:t>
+        <w:t xml:space="preserve"> </w:t>
+      </w:r>
+      <w:proofErr w:type="spellStart"/>
+      <w:r>
+        <w:rPr>
+          <w:rFonts w:ascii="Cascadia Mono" w:hAnsi="Cascadia Mono" w:cs="Cascadia Mono"/>
+          <w:color w:val="000000"/>
+          <w:sz w:val="19"/>
+          <w:szCs w:val="19"/>
+          <w:highlight w:val="white"/>
+          <w:lang w:eastAsia="en-US"/>
+        </w:rPr>
+        <w:t>lastMonth</w:t>
+      </w:r>
+      <w:proofErr w:type="spellEnd"/>
+      <w:r>
+        <w:rPr>
+          <w:rFonts w:ascii="Cascadia Mono" w:hAnsi="Cascadia Mono" w:cs="Cascadia Mono"/>
+          <w:color w:val="000000"/>
+          <w:sz w:val="19"/>
+          <w:szCs w:val="19"/>
+          <w:highlight w:val="white"/>
+          <w:lang w:eastAsia="en-US"/>
+        </w:rPr>
+        <w:t xml:space="preserve"> = </w:t>
       </w:r>
       <w:r>
         <w:rPr>
@@ -6791,7 +8839,31 @@
           <w:highlight w:val="white"/>
           <w:lang w:eastAsia="en-US"/>
         </w:rPr>
-        <w:t xml:space="preserve"> CustomerSubscription(</w:t>
+        <w:t xml:space="preserve"> </w:t>
+      </w:r>
+      <w:proofErr w:type="spellStart"/>
+      <w:r>
+        <w:rPr>
+          <w:rFonts w:ascii="Cascadia Mono" w:hAnsi="Cascadia Mono" w:cs="Cascadia Mono"/>
+          <w:color w:val="000000"/>
+          <w:sz w:val="19"/>
+          <w:szCs w:val="19"/>
+          <w:highlight w:val="white"/>
+          <w:lang w:eastAsia="en-US"/>
+        </w:rPr>
+        <w:t>CustomerSubscription</w:t>
+      </w:r>
+      <w:proofErr w:type="spellEnd"/>
+      <w:r>
+        <w:rPr>
+          <w:rFonts w:ascii="Cascadia Mono" w:hAnsi="Cascadia Mono" w:cs="Cascadia Mono"/>
+          <w:color w:val="000000"/>
+          <w:sz w:val="19"/>
+          <w:szCs w:val="19"/>
+          <w:highlight w:val="white"/>
+          <w:lang w:eastAsia="en-US"/>
+        </w:rPr>
+        <w:t>(</w:t>
       </w:r>
       <w:r>
         <w:rPr>
@@ -6886,7 +8958,31 @@
           <w:highlight w:val="white"/>
           <w:lang w:eastAsia="en-US"/>
         </w:rPr>
-        <w:t xml:space="preserve"> CustomerSubscription(</w:t>
+        <w:t xml:space="preserve"> </w:t>
+      </w:r>
+      <w:proofErr w:type="spellStart"/>
+      <w:r>
+        <w:rPr>
+          <w:rFonts w:ascii="Cascadia Mono" w:hAnsi="Cascadia Mono" w:cs="Cascadia Mono"/>
+          <w:color w:val="000000"/>
+          <w:sz w:val="19"/>
+          <w:szCs w:val="19"/>
+          <w:highlight w:val="white"/>
+          <w:lang w:eastAsia="en-US"/>
+        </w:rPr>
+        <w:t>CustomerSubscription</w:t>
+      </w:r>
+      <w:proofErr w:type="spellEnd"/>
+      <w:r>
+        <w:rPr>
+          <w:rFonts w:ascii="Cascadia Mono" w:hAnsi="Cascadia Mono" w:cs="Cascadia Mono"/>
+          <w:color w:val="000000"/>
+          <w:sz w:val="19"/>
+          <w:szCs w:val="19"/>
+          <w:highlight w:val="white"/>
+          <w:lang w:eastAsia="en-US"/>
+        </w:rPr>
+        <w:t>(</w:t>
       </w:r>
       <w:r>
         <w:rPr>
@@ -7022,7 +9118,31 @@
           <w:highlight w:val="white"/>
           <w:lang w:eastAsia="en-US"/>
         </w:rPr>
-        <w:t xml:space="preserve"> thisMonth = </w:t>
+        <w:t xml:space="preserve"> </w:t>
+      </w:r>
+      <w:proofErr w:type="spellStart"/>
+      <w:r>
+        <w:rPr>
+          <w:rFonts w:ascii="Cascadia Mono" w:hAnsi="Cascadia Mono" w:cs="Cascadia Mono"/>
+          <w:color w:val="000000"/>
+          <w:sz w:val="19"/>
+          <w:szCs w:val="19"/>
+          <w:highlight w:val="white"/>
+          <w:lang w:eastAsia="en-US"/>
+        </w:rPr>
+        <w:t>thisMonth</w:t>
+      </w:r>
+      <w:proofErr w:type="spellEnd"/>
+      <w:r>
+        <w:rPr>
+          <w:rFonts w:ascii="Cascadia Mono" w:hAnsi="Cascadia Mono" w:cs="Cascadia Mono"/>
+          <w:color w:val="000000"/>
+          <w:sz w:val="19"/>
+          <w:szCs w:val="19"/>
+          <w:highlight w:val="white"/>
+          <w:lang w:eastAsia="en-US"/>
+        </w:rPr>
+        <w:t xml:space="preserve"> = </w:t>
       </w:r>
       <w:r>
         <w:rPr>
@@ -7120,7 +9240,31 @@
           <w:highlight w:val="white"/>
           <w:lang w:eastAsia="en-US"/>
         </w:rPr>
-        <w:t xml:space="preserve"> CustomerSubscription(</w:t>
+        <w:t xml:space="preserve"> </w:t>
+      </w:r>
+      <w:proofErr w:type="spellStart"/>
+      <w:r>
+        <w:rPr>
+          <w:rFonts w:ascii="Cascadia Mono" w:hAnsi="Cascadia Mono" w:cs="Cascadia Mono"/>
+          <w:color w:val="000000"/>
+          <w:sz w:val="19"/>
+          <w:szCs w:val="19"/>
+          <w:highlight w:val="white"/>
+          <w:lang w:eastAsia="en-US"/>
+        </w:rPr>
+        <w:t>CustomerSubscription</w:t>
+      </w:r>
+      <w:proofErr w:type="spellEnd"/>
+      <w:r>
+        <w:rPr>
+          <w:rFonts w:ascii="Cascadia Mono" w:hAnsi="Cascadia Mono" w:cs="Cascadia Mono"/>
+          <w:color w:val="000000"/>
+          <w:sz w:val="19"/>
+          <w:szCs w:val="19"/>
+          <w:highlight w:val="white"/>
+          <w:lang w:eastAsia="en-US"/>
+        </w:rPr>
+        <w:t>(</w:t>
       </w:r>
       <w:r>
         <w:rPr>
@@ -7224,7 +9368,31 @@
           <w:highlight w:val="white"/>
           <w:lang w:eastAsia="en-US"/>
         </w:rPr>
-        <w:t xml:space="preserve"> CustomerSubscription(</w:t>
+        <w:t xml:space="preserve"> </w:t>
+      </w:r>
+      <w:proofErr w:type="spellStart"/>
+      <w:r>
+        <w:rPr>
+          <w:rFonts w:ascii="Cascadia Mono" w:hAnsi="Cascadia Mono" w:cs="Cascadia Mono"/>
+          <w:color w:val="000000"/>
+          <w:sz w:val="19"/>
+          <w:szCs w:val="19"/>
+          <w:highlight w:val="white"/>
+          <w:lang w:eastAsia="en-US"/>
+        </w:rPr>
+        <w:t>CustomerSubscription</w:t>
+      </w:r>
+      <w:proofErr w:type="spellEnd"/>
+      <w:r>
+        <w:rPr>
+          <w:rFonts w:ascii="Cascadia Mono" w:hAnsi="Cascadia Mono" w:cs="Cascadia Mono"/>
+          <w:color w:val="000000"/>
+          <w:sz w:val="19"/>
+          <w:szCs w:val="19"/>
+          <w:highlight w:val="white"/>
+          <w:lang w:eastAsia="en-US"/>
+        </w:rPr>
+        <w:t>(</w:t>
       </w:r>
       <w:r>
         <w:rPr>
@@ -7328,7 +9496,31 @@
           <w:highlight w:val="white"/>
           <w:lang w:eastAsia="en-US"/>
         </w:rPr>
-        <w:t xml:space="preserve"> CustomerSubscription(</w:t>
+        <w:t xml:space="preserve"> </w:t>
+      </w:r>
+      <w:proofErr w:type="spellStart"/>
+      <w:r>
+        <w:rPr>
+          <w:rFonts w:ascii="Cascadia Mono" w:hAnsi="Cascadia Mono" w:cs="Cascadia Mono"/>
+          <w:color w:val="000000"/>
+          <w:sz w:val="19"/>
+          <w:szCs w:val="19"/>
+          <w:highlight w:val="white"/>
+          <w:lang w:eastAsia="en-US"/>
+        </w:rPr>
+        <w:t>CustomerSubscription</w:t>
+      </w:r>
+      <w:proofErr w:type="spellEnd"/>
+      <w:r>
+        <w:rPr>
+          <w:rFonts w:ascii="Cascadia Mono" w:hAnsi="Cascadia Mono" w:cs="Cascadia Mono"/>
+          <w:color w:val="000000"/>
+          <w:sz w:val="19"/>
+          <w:szCs w:val="19"/>
+          <w:highlight w:val="white"/>
+          <w:lang w:eastAsia="en-US"/>
+        </w:rPr>
+        <w:t>(</w:t>
       </w:r>
       <w:r>
         <w:rPr>
@@ -7475,7 +9667,79 @@
           <w:highlight w:val="white"/>
           <w:lang w:eastAsia="en-US"/>
         </w:rPr>
-        <w:t xml:space="preserve"> summary = RevenueCalculator.Calculate(lastMonth, thisMonth);</w:t>
+        <w:t xml:space="preserve"> summary = </w:t>
+      </w:r>
+      <w:proofErr w:type="spellStart"/>
+      <w:r>
+        <w:rPr>
+          <w:rFonts w:ascii="Cascadia Mono" w:hAnsi="Cascadia Mono" w:cs="Cascadia Mono"/>
+          <w:color w:val="000000"/>
+          <w:sz w:val="19"/>
+          <w:szCs w:val="19"/>
+          <w:highlight w:val="white"/>
+          <w:lang w:eastAsia="en-US"/>
+        </w:rPr>
+        <w:t>RevenueCalculator.Calculate</w:t>
+      </w:r>
+      <w:proofErr w:type="spellEnd"/>
+      <w:r>
+        <w:rPr>
+          <w:rFonts w:ascii="Cascadia Mono" w:hAnsi="Cascadia Mono" w:cs="Cascadia Mono"/>
+          <w:color w:val="000000"/>
+          <w:sz w:val="19"/>
+          <w:szCs w:val="19"/>
+          <w:highlight w:val="white"/>
+          <w:lang w:eastAsia="en-US"/>
+        </w:rPr>
+        <w:t>(</w:t>
+      </w:r>
+      <w:proofErr w:type="spellStart"/>
+      <w:r>
+        <w:rPr>
+          <w:rFonts w:ascii="Cascadia Mono" w:hAnsi="Cascadia Mono" w:cs="Cascadia Mono"/>
+          <w:color w:val="000000"/>
+          <w:sz w:val="19"/>
+          <w:szCs w:val="19"/>
+          <w:highlight w:val="white"/>
+          <w:lang w:eastAsia="en-US"/>
+        </w:rPr>
+        <w:t>lastMonth</w:t>
+      </w:r>
+      <w:proofErr w:type="spellEnd"/>
+      <w:r>
+        <w:rPr>
+          <w:rFonts w:ascii="Cascadia Mono" w:hAnsi="Cascadia Mono" w:cs="Cascadia Mono"/>
+          <w:color w:val="000000"/>
+          <w:sz w:val="19"/>
+          <w:szCs w:val="19"/>
+          <w:highlight w:val="white"/>
+          <w:lang w:eastAsia="en-US"/>
+        </w:rPr>
+        <w:t xml:space="preserve">, </w:t>
+      </w:r>
+      <w:proofErr w:type="spellStart"/>
+      <w:r>
+        <w:rPr>
+          <w:rFonts w:ascii="Cascadia Mono" w:hAnsi="Cascadia Mono" w:cs="Cascadia Mono"/>
+          <w:color w:val="000000"/>
+          <w:sz w:val="19"/>
+          <w:szCs w:val="19"/>
+          <w:highlight w:val="white"/>
+          <w:lang w:eastAsia="en-US"/>
+        </w:rPr>
+        <w:t>thisMonth</w:t>
+      </w:r>
+      <w:proofErr w:type="spellEnd"/>
+      <w:r>
+        <w:rPr>
+          <w:rFonts w:ascii="Cascadia Mono" w:hAnsi="Cascadia Mono" w:cs="Cascadia Mono"/>
+          <w:color w:val="000000"/>
+          <w:sz w:val="19"/>
+          <w:szCs w:val="19"/>
+          <w:highlight w:val="white"/>
+          <w:lang w:eastAsia="en-US"/>
+        </w:rPr>
+        <w:t>);</w:t>
       </w:r>
     </w:p>
     <w:p>
@@ -7518,7 +9782,55 @@
           <w:highlight w:val="white"/>
           <w:lang w:eastAsia="en-US"/>
         </w:rPr>
-        <w:t xml:space="preserve">        Assert.Equal(125m, summary.ActiveMrr);       </w:t>
+        <w:t xml:space="preserve">        </w:t>
+      </w:r>
+      <w:proofErr w:type="spellStart"/>
+      <w:r>
+        <w:rPr>
+          <w:rFonts w:ascii="Cascadia Mono" w:hAnsi="Cascadia Mono" w:cs="Cascadia Mono"/>
+          <w:color w:val="000000"/>
+          <w:sz w:val="19"/>
+          <w:szCs w:val="19"/>
+          <w:highlight w:val="white"/>
+          <w:lang w:eastAsia="en-US"/>
+        </w:rPr>
+        <w:t>Assert.Equal</w:t>
+      </w:r>
+      <w:proofErr w:type="spellEnd"/>
+      <w:r>
+        <w:rPr>
+          <w:rFonts w:ascii="Cascadia Mono" w:hAnsi="Cascadia Mono" w:cs="Cascadia Mono"/>
+          <w:color w:val="000000"/>
+          <w:sz w:val="19"/>
+          <w:szCs w:val="19"/>
+          <w:highlight w:val="white"/>
+          <w:lang w:eastAsia="en-US"/>
+        </w:rPr>
+        <w:t xml:space="preserve">(125m, </w:t>
+      </w:r>
+      <w:proofErr w:type="spellStart"/>
+      <w:r>
+        <w:rPr>
+          <w:rFonts w:ascii="Cascadia Mono" w:hAnsi="Cascadia Mono" w:cs="Cascadia Mono"/>
+          <w:color w:val="000000"/>
+          <w:sz w:val="19"/>
+          <w:szCs w:val="19"/>
+          <w:highlight w:val="white"/>
+          <w:lang w:eastAsia="en-US"/>
+        </w:rPr>
+        <w:t>summary.ActiveMrr</w:t>
+      </w:r>
+      <w:proofErr w:type="spellEnd"/>
+      <w:r>
+        <w:rPr>
+          <w:rFonts w:ascii="Cascadia Mono" w:hAnsi="Cascadia Mono" w:cs="Cascadia Mono"/>
+          <w:color w:val="000000"/>
+          <w:sz w:val="19"/>
+          <w:szCs w:val="19"/>
+          <w:highlight w:val="white"/>
+          <w:lang w:eastAsia="en-US"/>
+        </w:rPr>
+        <w:t xml:space="preserve">);       </w:t>
       </w:r>
       <w:r>
         <w:rPr>
@@ -7556,7 +9868,31 @@
           <w:highlight w:val="white"/>
           <w:lang w:eastAsia="en-US"/>
         </w:rPr>
-        <w:t xml:space="preserve">        Assert.Equal(</w:t>
+        <w:t xml:space="preserve">        </w:t>
+      </w:r>
+      <w:proofErr w:type="spellStart"/>
+      <w:r>
+        <w:rPr>
+          <w:rFonts w:ascii="Cascadia Mono" w:hAnsi="Cascadia Mono" w:cs="Cascadia Mono"/>
+          <w:color w:val="000000"/>
+          <w:sz w:val="19"/>
+          <w:szCs w:val="19"/>
+          <w:highlight w:val="white"/>
+          <w:lang w:eastAsia="en-US"/>
+        </w:rPr>
+        <w:t>Assert.Equal</w:t>
+      </w:r>
+      <w:proofErr w:type="spellEnd"/>
+      <w:r>
+        <w:rPr>
+          <w:rFonts w:ascii="Cascadia Mono" w:hAnsi="Cascadia Mono" w:cs="Cascadia Mono"/>
+          <w:color w:val="000000"/>
+          <w:sz w:val="19"/>
+          <w:szCs w:val="19"/>
+          <w:highlight w:val="white"/>
+          <w:lang w:eastAsia="en-US"/>
+        </w:rPr>
+        <w:t>(</w:t>
       </w:r>
       <w:r>
         <w:rPr>
@@ -7578,7 +9914,31 @@
           <w:highlight w:val="white"/>
           <w:lang w:eastAsia="en-US"/>
         </w:rPr>
-        <w:t xml:space="preserve">m, summary.ChurnedRevenue);  </w:t>
+        <w:t xml:space="preserve">m, </w:t>
+      </w:r>
+      <w:proofErr w:type="spellStart"/>
+      <w:r>
+        <w:rPr>
+          <w:rFonts w:ascii="Cascadia Mono" w:hAnsi="Cascadia Mono" w:cs="Cascadia Mono"/>
+          <w:color w:val="000000"/>
+          <w:sz w:val="19"/>
+          <w:szCs w:val="19"/>
+          <w:highlight w:val="white"/>
+          <w:lang w:eastAsia="en-US"/>
+        </w:rPr>
+        <w:t>summary.ChurnedRevenue</w:t>
+      </w:r>
+      <w:proofErr w:type="spellEnd"/>
+      <w:r>
+        <w:rPr>
+          <w:rFonts w:ascii="Cascadia Mono" w:hAnsi="Cascadia Mono" w:cs="Cascadia Mono"/>
+          <w:color w:val="000000"/>
+          <w:sz w:val="19"/>
+          <w:szCs w:val="19"/>
+          <w:highlight w:val="white"/>
+          <w:lang w:eastAsia="en-US"/>
+        </w:rPr>
+        <w:t xml:space="preserve">);  </w:t>
       </w:r>
       <w:r>
         <w:rPr>
@@ -7616,7 +9976,31 @@
           <w:highlight w:val="white"/>
           <w:lang w:eastAsia="en-US"/>
         </w:rPr>
-        <w:t xml:space="preserve">        Assert.Equal(</w:t>
+        <w:t xml:space="preserve">        </w:t>
+      </w:r>
+      <w:proofErr w:type="spellStart"/>
+      <w:r>
+        <w:rPr>
+          <w:rFonts w:ascii="Cascadia Mono" w:hAnsi="Cascadia Mono" w:cs="Cascadia Mono"/>
+          <w:color w:val="000000"/>
+          <w:sz w:val="19"/>
+          <w:szCs w:val="19"/>
+          <w:highlight w:val="white"/>
+          <w:lang w:eastAsia="en-US"/>
+        </w:rPr>
+        <w:t>Assert.Equal</w:t>
+      </w:r>
+      <w:proofErr w:type="spellEnd"/>
+      <w:r>
+        <w:rPr>
+          <w:rFonts w:ascii="Cascadia Mono" w:hAnsi="Cascadia Mono" w:cs="Cascadia Mono"/>
+          <w:color w:val="000000"/>
+          <w:sz w:val="19"/>
+          <w:szCs w:val="19"/>
+          <w:highlight w:val="white"/>
+          <w:lang w:eastAsia="en-US"/>
+        </w:rPr>
+        <w:t>(</w:t>
       </w:r>
       <w:r>
         <w:rPr>
@@ -7638,7 +10022,31 @@
           <w:highlight w:val="white"/>
           <w:lang w:eastAsia="en-US"/>
         </w:rPr>
-        <w:t xml:space="preserve">m, summary.NetMrr);           </w:t>
+        <w:t xml:space="preserve">m, </w:t>
+      </w:r>
+      <w:proofErr w:type="spellStart"/>
+      <w:r>
+        <w:rPr>
+          <w:rFonts w:ascii="Cascadia Mono" w:hAnsi="Cascadia Mono" w:cs="Cascadia Mono"/>
+          <w:color w:val="000000"/>
+          <w:sz w:val="19"/>
+          <w:szCs w:val="19"/>
+          <w:highlight w:val="white"/>
+          <w:lang w:eastAsia="en-US"/>
+        </w:rPr>
+        <w:t>summary.NetMrr</w:t>
+      </w:r>
+      <w:proofErr w:type="spellEnd"/>
+      <w:r>
+        <w:rPr>
+          <w:rFonts w:ascii="Cascadia Mono" w:hAnsi="Cascadia Mono" w:cs="Cascadia Mono"/>
+          <w:color w:val="000000"/>
+          <w:sz w:val="19"/>
+          <w:szCs w:val="19"/>
+          <w:highlight w:val="white"/>
+          <w:lang w:eastAsia="en-US"/>
+        </w:rPr>
+        <w:t xml:space="preserve">);           </w:t>
       </w:r>
       <w:r>
         <w:rPr>
@@ -7790,7 +10198,31 @@
           <w:highlight w:val="white"/>
           <w:lang w:eastAsia="en-US"/>
         </w:rPr>
-        <w:t xml:space="preserve"> Ctor_ThrowsForNegativeAmount()</w:t>
+        <w:t xml:space="preserve"> </w:t>
+      </w:r>
+      <w:proofErr w:type="spellStart"/>
+      <w:r>
+        <w:rPr>
+          <w:rFonts w:ascii="Cascadia Mono" w:hAnsi="Cascadia Mono" w:cs="Cascadia Mono"/>
+          <w:color w:val="000000"/>
+          <w:sz w:val="19"/>
+          <w:szCs w:val="19"/>
+          <w:highlight w:val="white"/>
+          <w:lang w:eastAsia="en-US"/>
+        </w:rPr>
+        <w:t>Ctor_ThrowsForNegativeAmount</w:t>
+      </w:r>
+      <w:proofErr w:type="spellEnd"/>
+      <w:r>
+        <w:rPr>
+          <w:rFonts w:ascii="Cascadia Mono" w:hAnsi="Cascadia Mono" w:cs="Cascadia Mono"/>
+          <w:color w:val="000000"/>
+          <w:sz w:val="19"/>
+          <w:szCs w:val="19"/>
+          <w:highlight w:val="white"/>
+          <w:lang w:eastAsia="en-US"/>
+        </w:rPr>
+        <w:t>()</w:t>
       </w:r>
     </w:p>
     <w:p>
@@ -7844,8 +10276,33 @@
           <w:highlight w:val="white"/>
           <w:lang w:eastAsia="en-US"/>
         </w:rPr>
-        <w:t xml:space="preserve">        Assert.Throws&lt;</w:t>
-      </w:r>
+        <w:t xml:space="preserve">        </w:t>
+      </w:r>
+      <w:proofErr w:type="spellStart"/>
+      <w:r>
+        <w:rPr>
+          <w:rFonts w:ascii="Cascadia Mono" w:hAnsi="Cascadia Mono" w:cs="Cascadia Mono"/>
+          <w:color w:val="000000"/>
+          <w:sz w:val="19"/>
+          <w:szCs w:val="19"/>
+          <w:highlight w:val="white"/>
+          <w:lang w:eastAsia="en-US"/>
+        </w:rPr>
+        <w:t>Assert.Throws</w:t>
+      </w:r>
+      <w:proofErr w:type="spellEnd"/>
+      <w:r>
+        <w:rPr>
+          <w:rFonts w:ascii="Cascadia Mono" w:hAnsi="Cascadia Mono" w:cs="Cascadia Mono"/>
+          <w:color w:val="000000"/>
+          <w:sz w:val="19"/>
+          <w:szCs w:val="19"/>
+          <w:highlight w:val="white"/>
+          <w:lang w:eastAsia="en-US"/>
+        </w:rPr>
+        <w:t>&lt;</w:t>
+      </w:r>
+      <w:proofErr w:type="spellStart"/>
       <w:r>
         <w:rPr>
           <w:rFonts w:ascii="Cascadia Mono" w:hAnsi="Cascadia Mono" w:cs="Cascadia Mono"/>
@@ -7857,6 +10314,7 @@
         </w:rPr>
         <w:t>ArgumentException</w:t>
       </w:r>
+      <w:proofErr w:type="spellEnd"/>
       <w:r>
         <w:rPr>
           <w:rFonts w:ascii="Cascadia Mono" w:hAnsi="Cascadia Mono" w:cs="Cascadia Mono"/>
@@ -7915,7 +10373,31 @@
           <w:highlight w:val="white"/>
           <w:lang w:eastAsia="en-US"/>
         </w:rPr>
-        <w:t xml:space="preserve"> CustomerSubscription(</w:t>
+        <w:t xml:space="preserve"> </w:t>
+      </w:r>
+      <w:proofErr w:type="spellStart"/>
+      <w:r>
+        <w:rPr>
+          <w:rFonts w:ascii="Cascadia Mono" w:hAnsi="Cascadia Mono" w:cs="Cascadia Mono"/>
+          <w:color w:val="000000"/>
+          <w:sz w:val="19"/>
+          <w:szCs w:val="19"/>
+          <w:highlight w:val="white"/>
+          <w:lang w:eastAsia="en-US"/>
+        </w:rPr>
+        <w:t>CustomerSubscription</w:t>
+      </w:r>
+      <w:proofErr w:type="spellEnd"/>
+      <w:r>
+        <w:rPr>
+          <w:rFonts w:ascii="Cascadia Mono" w:hAnsi="Cascadia Mono" w:cs="Cascadia Mono"/>
+          <w:color w:val="000000"/>
+          <w:sz w:val="19"/>
+          <w:szCs w:val="19"/>
+          <w:highlight w:val="white"/>
+          <w:lang w:eastAsia="en-US"/>
+        </w:rPr>
+        <w:t>(</w:t>
       </w:r>
       <w:r>
         <w:rPr>
@@ -8207,7 +10689,15 @@
         </w:numPr>
       </w:pPr>
       <w:r>
-        <w:t>Do not initialize with a README or .gitignore if you want to keep the local folder as the source of truth.</w:t>
+        <w:t>Do not initialize with a README or .</w:t>
+      </w:r>
+      <w:proofErr w:type="spellStart"/>
+      <w:r>
+        <w:t>gitignore</w:t>
+      </w:r>
+      <w:proofErr w:type="spellEnd"/>
+      <w:r>
+        <w:t xml:space="preserve"> if you want to keep the local folder as the source of truth.</w:t>
       </w:r>
       <w:r>
         <w:br/>
@@ -8246,7 +10736,15 @@
         <w:tab/>
       </w:r>
       <w:r>
-        <w:t>From the root SubscriptionMetrics folder:</w:t>
+        <w:t xml:space="preserve">From the root </w:t>
+      </w:r>
+      <w:proofErr w:type="spellStart"/>
+      <w:r>
+        <w:t>SubscriptionMetrics</w:t>
+      </w:r>
+      <w:proofErr w:type="spellEnd"/>
+      <w:r>
+        <w:t xml:space="preserve"> folder:</w:t>
       </w:r>
     </w:p>
     <w:p>
@@ -8283,8 +10781,18 @@
           <w:b/>
           <w:bCs/>
         </w:rPr>
-        <w:t xml:space="preserve"> init</w:t>
-      </w:r>
+        <w:t xml:space="preserve"> </w:t>
+      </w:r>
+      <w:proofErr w:type="spellStart"/>
+      <w:r>
+        <w:rPr>
+          <w:rFonts w:ascii="Courier New" w:hAnsi="Courier New" w:cs="Courier New"/>
+          <w:b/>
+          <w:bCs/>
+        </w:rPr>
+        <w:t>init</w:t>
+      </w:r>
+      <w:proofErr w:type="spellEnd"/>
     </w:p>
     <w:p>
       <w:pPr>
@@ -8499,6 +11007,12 @@
       </w:r>
     </w:p>
     <w:p>
+      <w:r>
+        <w:tab/>
+        <w:t>Using Bash:</w:t>
+      </w:r>
+    </w:p>
+    <w:p>
       <w:pPr>
         <w:ind w:firstLine="720"/>
         <w:rPr>
@@ -8507,6 +11021,7 @@
           <w:bCs/>
         </w:rPr>
       </w:pPr>
+      <w:proofErr w:type="spellStart"/>
       <w:r>
         <w:rPr>
           <w:rFonts w:ascii="Courier New" w:hAnsi="Courier New" w:cs="Courier New"/>
@@ -8516,20 +11031,70 @@
           <w:sz w:val="24"/>
           <w:szCs w:val="24"/>
         </w:rPr>
-        <w:t xml:space="preserve">mkdir </w:t>
-      </w:r>
+        <w:t>mkdir</w:t>
+      </w:r>
+      <w:proofErr w:type="spellEnd"/>
       <w:r>
         <w:rPr>
           <w:rFonts w:ascii="Courier New" w:hAnsi="Courier New" w:cs="Courier New"/>
           <w:b/>
           <w:bCs/>
+          <w:color w:val="0070C0"/>
           <w:sz w:val="24"/>
           <w:szCs w:val="24"/>
         </w:rPr>
-        <w:t>-p .github/workflows</w:t>
-      </w:r>
-    </w:p>
-    <w:p>
+        <w:t xml:space="preserve"> </w:t>
+      </w:r>
+      <w:r>
+        <w:rPr>
+          <w:rFonts w:ascii="Courier New" w:hAnsi="Courier New" w:cs="Courier New"/>
+          <w:b/>
+          <w:bCs/>
+          <w:sz w:val="24"/>
+          <w:szCs w:val="24"/>
+        </w:rPr>
+        <w:t>-p .</w:t>
+      </w:r>
+      <w:proofErr w:type="spellStart"/>
+      <w:r>
+        <w:rPr>
+          <w:rFonts w:ascii="Courier New" w:hAnsi="Courier New" w:cs="Courier New"/>
+          <w:b/>
+          <w:bCs/>
+          <w:sz w:val="24"/>
+          <w:szCs w:val="24"/>
+        </w:rPr>
+        <w:t>github</w:t>
+      </w:r>
+      <w:proofErr w:type="spellEnd"/>
+      <w:r>
+        <w:rPr>
+          <w:rFonts w:ascii="Courier New" w:hAnsi="Courier New" w:cs="Courier New"/>
+          <w:b/>
+          <w:bCs/>
+          <w:sz w:val="24"/>
+          <w:szCs w:val="24"/>
+        </w:rPr>
+        <w:t>/workflows</w:t>
+      </w:r>
+    </w:p>
+    <w:p/>
+    <w:p>
+      <w:pPr>
+        <w:ind w:firstLine="720"/>
+      </w:pPr>
+      <w:r>
+        <w:t xml:space="preserve">Note: </w:t>
+      </w:r>
+      <w:r>
+        <w:t xml:space="preserve">If you are on Windows </w:t>
+      </w:r>
+      <w:r>
+        <w:t>Command Line</w:t>
+      </w:r>
+      <w:r>
+        <w:t>, create the folders manually.</w:t>
+      </w:r>
       <w:r>
         <w:br/>
       </w:r>
@@ -8546,8 +11111,17 @@
           <w:b/>
           <w:bCs/>
         </w:rPr>
-        <w:t>Create dotnet-ci.yml</w:t>
-      </w:r>
+        <w:t>Create dotnet-</w:t>
+      </w:r>
+      <w:proofErr w:type="spellStart"/>
+      <w:r>
+        <w:rPr>
+          <w:b/>
+          <w:bCs/>
+        </w:rPr>
+        <w:t>ci.yml</w:t>
+      </w:r>
+      <w:proofErr w:type="spellEnd"/>
       <w:r>
         <w:rPr>
           <w:b/>
@@ -8572,8 +11146,39 @@
           <w:sz w:val="24"/>
           <w:szCs w:val="24"/>
         </w:rPr>
-        <w:t>.github/workflows/dotnet-ci.yml</w:t>
-      </w:r>
+        <w:t>.</w:t>
+      </w:r>
+      <w:proofErr w:type="spellStart"/>
+      <w:r>
+        <w:rPr>
+          <w:b/>
+          <w:bCs/>
+          <w:sz w:val="24"/>
+          <w:szCs w:val="24"/>
+        </w:rPr>
+        <w:t>github</w:t>
+      </w:r>
+      <w:proofErr w:type="spellEnd"/>
+      <w:r>
+        <w:rPr>
+          <w:b/>
+          <w:bCs/>
+          <w:sz w:val="24"/>
+          <w:szCs w:val="24"/>
+        </w:rPr>
+        <w:t>/workflows/dotnet-</w:t>
+      </w:r>
+      <w:proofErr w:type="spellStart"/>
+      <w:r>
+        <w:rPr>
+          <w:b/>
+          <w:bCs/>
+          <w:sz w:val="24"/>
+          <w:szCs w:val="24"/>
+        </w:rPr>
+        <w:t>ci.yml</w:t>
+      </w:r>
+      <w:proofErr w:type="spellEnd"/>
       <w:r>
         <w:t>:</w:t>
       </w:r>
@@ -8862,6 +11467,7 @@
         </w:rPr>
         <w:t xml:space="preserve">  </w:t>
       </w:r>
+      <w:proofErr w:type="spellStart"/>
       <w:r>
         <w:rPr>
           <w:rFonts w:ascii="Cascadia Mono" w:hAnsi="Cascadia Mono" w:cs="Cascadia Mono"/>
@@ -8873,7 +11479,21 @@
           <w:highlight w:val="white"/>
           <w:lang w:eastAsia="en-US"/>
         </w:rPr>
-        <w:t>pull_request:</w:t>
+        <w:t>pull_request</w:t>
+      </w:r>
+      <w:proofErr w:type="spellEnd"/>
+      <w:r>
+        <w:rPr>
+          <w:rFonts w:ascii="Cascadia Mono" w:hAnsi="Cascadia Mono" w:cs="Cascadia Mono"/>
+          <w:b/>
+          <w:bCs/>
+          <w:color w:val="0000FF"/>
+          <w:sz w:val="19"/>
+          <w:szCs w:val="19"/>
+          <w:highlight w:val="white"/>
+          <w:lang w:eastAsia="en-US"/>
+        </w:rPr>
+        <w:t>:</w:t>
       </w:r>
     </w:p>
     <w:p>
@@ -10226,7 +12846,15 @@
         <w:tab/>
       </w:r>
       <w:r>
-        <w:t>defines triggers (push, pull_request).</w:t>
+        <w:t xml:space="preserve">defines triggers (push, </w:t>
+      </w:r>
+      <w:proofErr w:type="spellStart"/>
+      <w:r>
+        <w:t>pull_request</w:t>
+      </w:r>
+      <w:proofErr w:type="spellEnd"/>
+      <w:r>
+        <w:t>).</w:t>
       </w:r>
     </w:p>
     <w:p>
@@ -10353,8 +12981,42 @@
           <w:sz w:val="24"/>
           <w:szCs w:val="24"/>
         </w:rPr>
-        <w:t xml:space="preserve"> add .github/workflows/dotnet-ci.yml</w:t>
-      </w:r>
+        <w:t xml:space="preserve"> add .</w:t>
+      </w:r>
+      <w:proofErr w:type="spellStart"/>
+      <w:r>
+        <w:rPr>
+          <w:rFonts w:ascii="Courier New" w:hAnsi="Courier New" w:cs="Courier New"/>
+          <w:b/>
+          <w:bCs/>
+          <w:sz w:val="24"/>
+          <w:szCs w:val="24"/>
+        </w:rPr>
+        <w:t>github</w:t>
+      </w:r>
+      <w:proofErr w:type="spellEnd"/>
+      <w:r>
+        <w:rPr>
+          <w:rFonts w:ascii="Courier New" w:hAnsi="Courier New" w:cs="Courier New"/>
+          <w:b/>
+          <w:bCs/>
+          <w:sz w:val="24"/>
+          <w:szCs w:val="24"/>
+        </w:rPr>
+        <w:t>/workflows/dotnet-</w:t>
+      </w:r>
+      <w:proofErr w:type="spellStart"/>
+      <w:r>
+        <w:rPr>
+          <w:rFonts w:ascii="Courier New" w:hAnsi="Courier New" w:cs="Courier New"/>
+          <w:b/>
+          <w:bCs/>
+          <w:sz w:val="24"/>
+          <w:szCs w:val="24"/>
+        </w:rPr>
+        <w:t>ci.yml</w:t>
+      </w:r>
+      <w:proofErr w:type="spellEnd"/>
     </w:p>
     <w:p>
       <w:pPr>
@@ -10708,7 +13370,31 @@
           <w:highlight w:val="white"/>
           <w:lang w:eastAsia="en-US"/>
         </w:rPr>
-        <w:t>${{ matrix.os }}</w:t>
+        <w:t xml:space="preserve">${{ </w:t>
+      </w:r>
+      <w:proofErr w:type="spellStart"/>
+      <w:r>
+        <w:rPr>
+          <w:rFonts w:ascii="Cascadia Mono" w:hAnsi="Cascadia Mono" w:cs="Cascadia Mono"/>
+          <w:color w:val="A31515"/>
+          <w:sz w:val="19"/>
+          <w:szCs w:val="19"/>
+          <w:highlight w:val="white"/>
+          <w:lang w:eastAsia="en-US"/>
+        </w:rPr>
+        <w:t>matrix.os</w:t>
+      </w:r>
+      <w:proofErr w:type="spellEnd"/>
+      <w:r>
+        <w:rPr>
+          <w:rFonts w:ascii="Cascadia Mono" w:hAnsi="Cascadia Mono" w:cs="Cascadia Mono"/>
+          <w:color w:val="A31515"/>
+          <w:sz w:val="19"/>
+          <w:szCs w:val="19"/>
+          <w:highlight w:val="white"/>
+          <w:lang w:eastAsia="en-US"/>
+        </w:rPr>
+        <w:t xml:space="preserve"> }}</w:t>
       </w:r>
     </w:p>
     <w:p>
@@ -10813,6 +13499,7 @@
         </w:rPr>
         <w:t xml:space="preserve">        </w:t>
       </w:r>
+      <w:proofErr w:type="spellStart"/>
       <w:r>
         <w:rPr>
           <w:rFonts w:ascii="Cascadia Mono" w:hAnsi="Cascadia Mono" w:cs="Cascadia Mono"/>
@@ -10822,7 +13509,19 @@
           <w:highlight w:val="white"/>
           <w:lang w:eastAsia="en-US"/>
         </w:rPr>
-        <w:t>os:</w:t>
+        <w:t>os</w:t>
+      </w:r>
+      <w:proofErr w:type="spellEnd"/>
+      <w:r>
+        <w:rPr>
+          <w:rFonts w:ascii="Cascadia Mono" w:hAnsi="Cascadia Mono" w:cs="Cascadia Mono"/>
+          <w:color w:val="0000FF"/>
+          <w:sz w:val="19"/>
+          <w:szCs w:val="19"/>
+          <w:highlight w:val="white"/>
+          <w:lang w:eastAsia="en-US"/>
+        </w:rPr>
+        <w:t>:</w:t>
       </w:r>
       <w:r>
         <w:rPr>
@@ -10879,6 +13578,7 @@
         </w:rPr>
         <w:t xml:space="preserve">, </w:t>
       </w:r>
+      <w:proofErr w:type="spellStart"/>
       <w:r>
         <w:rPr>
           <w:rFonts w:ascii="Cascadia Mono" w:hAnsi="Cascadia Mono" w:cs="Cascadia Mono"/>
@@ -10888,7 +13588,19 @@
           <w:highlight w:val="white"/>
           <w:lang w:eastAsia="en-US"/>
         </w:rPr>
-        <w:t>macos-latest</w:t>
+        <w:t>macos</w:t>
+      </w:r>
+      <w:proofErr w:type="spellEnd"/>
+      <w:r>
+        <w:rPr>
+          <w:rFonts w:ascii="Cascadia Mono" w:hAnsi="Cascadia Mono" w:cs="Cascadia Mono"/>
+          <w:color w:val="A31515"/>
+          <w:sz w:val="19"/>
+          <w:szCs w:val="19"/>
+          <w:highlight w:val="white"/>
+          <w:lang w:eastAsia="en-US"/>
+        </w:rPr>
+        <w:t>-latest</w:t>
       </w:r>
       <w:r>
         <w:rPr>
@@ -10954,7 +13666,23 @@
           <w:b/>
           <w:bCs/>
         </w:rPr>
-        <w:t>Here is a sample yaml file:</w:t>
+        <w:t xml:space="preserve">Here is a sample </w:t>
+      </w:r>
+      <w:proofErr w:type="spellStart"/>
+      <w:r>
+        <w:rPr>
+          <w:b/>
+          <w:bCs/>
+        </w:rPr>
+        <w:t>yaml</w:t>
+      </w:r>
+      <w:proofErr w:type="spellEnd"/>
+      <w:r>
+        <w:rPr>
+          <w:b/>
+          <w:bCs/>
+        </w:rPr>
+        <w:t xml:space="preserve"> file:</w:t>
       </w:r>
       <w:r>
         <w:rPr>
@@ -11154,6 +13882,7 @@
         </w:rPr>
         <w:t xml:space="preserve">  </w:t>
       </w:r>
+      <w:proofErr w:type="spellStart"/>
       <w:r>
         <w:rPr>
           <w:rFonts w:ascii="Consolas" w:eastAsia="Times New Roman" w:hAnsi="Consolas" w:cs="Times New Roman"/>
@@ -11163,6 +13892,7 @@
         </w:rPr>
         <w:t>pull_request</w:t>
       </w:r>
+      <w:proofErr w:type="spellEnd"/>
       <w:r>
         <w:rPr>
           <w:rFonts w:ascii="Consolas" w:eastAsia="Times New Roman" w:hAnsi="Consolas" w:cs="Times New Roman"/>
@@ -11352,7 +14082,27 @@
           <w:sz w:val="21"/>
           <w:szCs w:val="21"/>
         </w:rPr>
-        <w:t>: ${{ matrix.os }}</w:t>
+        <w:t xml:space="preserve">: ${{ </w:t>
+      </w:r>
+      <w:proofErr w:type="spellStart"/>
+      <w:r>
+        <w:rPr>
+          <w:rFonts w:ascii="Consolas" w:eastAsia="Times New Roman" w:hAnsi="Consolas" w:cs="Times New Roman"/>
+          <w:color w:val="000000"/>
+          <w:sz w:val="21"/>
+          <w:szCs w:val="21"/>
+        </w:rPr>
+        <w:t>matrix.os</w:t>
+      </w:r>
+      <w:proofErr w:type="spellEnd"/>
+      <w:r>
+        <w:rPr>
+          <w:rFonts w:ascii="Consolas" w:eastAsia="Times New Roman" w:hAnsi="Consolas" w:cs="Times New Roman"/>
+          <w:color w:val="000000"/>
+          <w:sz w:val="21"/>
+          <w:szCs w:val="21"/>
+        </w:rPr>
+        <w:t xml:space="preserve"> }}</w:t>
       </w:r>
     </w:p>
     <w:p>
@@ -11469,6 +14219,7 @@
         </w:rPr>
         <w:t xml:space="preserve">        </w:t>
       </w:r>
+      <w:proofErr w:type="spellStart"/>
       <w:r>
         <w:rPr>
           <w:rFonts w:ascii="Consolas" w:eastAsia="Times New Roman" w:hAnsi="Consolas" w:cs="Times New Roman"/>
@@ -11478,6 +14229,7 @@
         </w:rPr>
         <w:t>os</w:t>
       </w:r>
+      <w:proofErr w:type="spellEnd"/>
       <w:r>
         <w:rPr>
           <w:rFonts w:ascii="Consolas" w:eastAsia="Times New Roman" w:hAnsi="Consolas" w:cs="Times New Roman"/>
@@ -11523,6 +14275,7 @@
         </w:rPr>
         <w:t xml:space="preserve">, </w:t>
       </w:r>
+      <w:proofErr w:type="spellStart"/>
       <w:r>
         <w:rPr>
           <w:rFonts w:ascii="Consolas" w:eastAsia="Times New Roman" w:hAnsi="Consolas" w:cs="Times New Roman"/>
@@ -11530,7 +14283,17 @@
           <w:sz w:val="21"/>
           <w:szCs w:val="21"/>
         </w:rPr>
-        <w:t>macos-latest</w:t>
+        <w:t>macos</w:t>
+      </w:r>
+      <w:proofErr w:type="spellEnd"/>
+      <w:r>
+        <w:rPr>
+          <w:rFonts w:ascii="Consolas" w:eastAsia="Times New Roman" w:hAnsi="Consolas" w:cs="Times New Roman"/>
+          <w:color w:val="0000FF"/>
+          <w:sz w:val="21"/>
+          <w:szCs w:val="21"/>
+        </w:rPr>
+        <w:t>-latest</w:t>
       </w:r>
       <w:r>
         <w:rPr>
@@ -15196,7 +17959,6 @@
   <w:style w:type="character" w:default="1" w:styleId="DefaultParagraphFont">
     <w:name w:val="Default Paragraph Font"/>
     <w:uiPriority w:val="1"/>
-    <w:semiHidden/>
     <w:unhideWhenUsed/>
   </w:style>
   <w:style w:type="table" w:default="1" w:styleId="TableNormal">

</xml_diff>